<commit_message>
docs: preserve summary template formatting when filling
</commit_message>
<xml_diff>
--- a/output/doc/1软件应用与开发_1Web应用与开发_Sak-AI答题助手/1 文档/中国大学生计算机设计大赛作品信息概要表-Sak-AI答题助手.docx
+++ b/output/doc/1软件应用与开发_1Web应用与开发_Sak-AI答题助手/1 文档/中国大学生计算机设计大赛作品信息概要表-Sak-AI答题助手.docx
@@ -128,14 +128,14 @@
           </w:tcPr>
           <w:p>
             <w:pPr>
-              <w:spacing w:after="0"/>
-            </w:pPr>
-            <w:r/>
-            <w:r>
-              <w:rPr>
-                <w:rFonts w:ascii="微软雅黑" w:hAnsi="微软雅黑" w:eastAsia="微软雅黑"/>
-                <w:b w:val="0"/>
-                <w:sz w:val="20"/>
+              <w:rPr>
+                <w:rFonts w:ascii="仿宋" w:eastAsia="仿宋" w:hAnsi="仿宋" w:hint="eastAsia"/>
+                <w:color w:val="000000" w:themeColor="text1"/>
+              </w:rPr>
+            </w:pPr>
+            <w:r>
+              <w:rPr>
+                <w:rFonts w:ascii="仿宋" w:hAnsi="仿宋" w:eastAsia="仿宋"/>
               </w:rPr>
               <w:t>待填写</w:t>
             </w:r>
@@ -171,14 +171,14 @@
           </w:tcPr>
           <w:p>
             <w:pPr>
-              <w:spacing w:after="0"/>
-            </w:pPr>
-            <w:r/>
-            <w:r>
-              <w:rPr>
-                <w:rFonts w:ascii="微软雅黑" w:hAnsi="微软雅黑" w:eastAsia="微软雅黑"/>
-                <w:b w:val="0"/>
-                <w:sz w:val="20"/>
+              <w:rPr>
+                <w:rFonts w:ascii="仿宋" w:eastAsia="仿宋" w:hAnsi="仿宋" w:hint="eastAsia"/>
+                <w:color w:val="000000" w:themeColor="text1"/>
+              </w:rPr>
+            </w:pPr>
+            <w:r>
+              <w:rPr>
+                <w:rFonts w:ascii="仿宋" w:hAnsi="仿宋" w:eastAsia="仿宋"/>
               </w:rPr>
               <w:t>Sak-AI答题助手</w:t>
             </w:r>
@@ -219,14 +219,14 @@
           </w:tcPr>
           <w:p>
             <w:pPr>
-              <w:spacing w:after="0"/>
-            </w:pPr>
-            <w:r/>
-            <w:r>
-              <w:rPr>
-                <w:rFonts w:ascii="微软雅黑" w:hAnsi="微软雅黑" w:eastAsia="微软雅黑"/>
-                <w:b w:val="0"/>
-                <w:sz w:val="20"/>
+              <w:rPr>
+                <w:rFonts w:ascii="仿宋" w:eastAsia="仿宋" w:hAnsi="仿宋" w:hint="eastAsia"/>
+                <w:color w:val="000000" w:themeColor="text1"/>
+              </w:rPr>
+            </w:pPr>
+            <w:r>
+              <w:rPr>
+                <w:rFonts w:ascii="仿宋" w:hAnsi="仿宋" w:eastAsia="仿宋"/>
               </w:rPr>
               <w:t>软件应用与开发</w:t>
             </w:r>
@@ -262,14 +262,14 @@
           </w:tcPr>
           <w:p>
             <w:pPr>
-              <w:spacing w:after="0"/>
-            </w:pPr>
-            <w:r/>
-            <w:r>
-              <w:rPr>
-                <w:rFonts w:ascii="微软雅黑" w:hAnsi="微软雅黑" w:eastAsia="微软雅黑"/>
-                <w:b w:val="0"/>
-                <w:sz w:val="20"/>
+              <w:rPr>
+                <w:rFonts w:ascii="仿宋" w:eastAsia="仿宋" w:hAnsi="仿宋" w:hint="eastAsia"/>
+                <w:color w:val="000000" w:themeColor="text1"/>
+              </w:rPr>
+            </w:pPr>
+            <w:r>
+              <w:rPr>
+                <w:rFonts w:ascii="仿宋" w:hAnsi="仿宋" w:eastAsia="仿宋"/>
               </w:rPr>
               <w:t>Web应用与开发</w:t>
             </w:r>
@@ -287,30 +287,98 @@
           </w:tcPr>
           <w:p>
             <w:pPr>
-              <w:spacing w:after="0"/>
-            </w:pPr>
-            <w:r/>
-            <w:r>
-              <w:rPr>
-                <w:rFonts w:ascii="微软雅黑" w:hAnsi="微软雅黑" w:eastAsia="微软雅黑"/>
-                <w:b w:val="0"/>
-                <w:sz w:val="20"/>
-              </w:rPr>
-              <w:t>作品简介(100字以内)：</w:t>
-            </w:r>
-          </w:p>
-          <w:p>
-            <w:pPr>
-              <w:spacing w:after="0"/>
-            </w:pPr>
-            <w:r>
-              <w:rPr>
-                <w:rFonts w:ascii="微软雅黑" w:hAnsi="微软雅黑" w:eastAsia="微软雅黑"/>
-                <w:b w:val="0"/>
-                <w:sz w:val="20"/>
-              </w:rPr>
-              <w:t>Sak-AI答题助手是面向备考场景的Web题库平台，集题库广场、个人题库、刷题、考试、数据中心、论坛与后台管理于一体，并配套微信小程序延展移动学习场景。</w:t>
-            </w:r>
+              <w:rPr>
+                <w:rFonts w:ascii="仿宋" w:eastAsia="仿宋" w:hAnsi="仿宋" w:hint="eastAsia"/>
+                <w:color w:val="000000" w:themeColor="text1"/>
+              </w:rPr>
+            </w:pPr>
+            <w:r>
+              <w:rPr>
+                <w:rFonts w:ascii="仿宋" w:eastAsia="仿宋" w:hAnsi="仿宋" w:hint="eastAsia"/>
+                <w:color w:val="000000" w:themeColor="text1"/>
+              </w:rPr>
+              <w:t>作品简介(</w:t>
+            </w:r>
+            <w:r>
+              <w:rPr>
+                <w:rFonts w:ascii="仿宋" w:eastAsia="仿宋" w:hAnsi="仿宋"/>
+                <w:color w:val="000000" w:themeColor="text1"/>
+              </w:rPr>
+              <w:t>100</w:t>
+            </w:r>
+            <w:r>
+              <w:rPr>
+                <w:rFonts w:ascii="仿宋" w:eastAsia="仿宋" w:hAnsi="仿宋" w:hint="eastAsia"/>
+                <w:color w:val="000000" w:themeColor="text1"/>
+              </w:rPr>
+              <w:t>字以内</w:t>
+            </w:r>
+            <w:r>
+              <w:rPr>
+                <w:rFonts w:ascii="仿宋" w:eastAsia="仿宋" w:hAnsi="仿宋"/>
+                <w:color w:val="000000" w:themeColor="text1"/>
+              </w:rPr>
+              <w:t>)</w:t>
+            </w:r>
+            <w:r>
+              <w:rPr>
+                <w:rFonts w:ascii="仿宋" w:eastAsia="仿宋" w:hAnsi="仿宋" w:hint="eastAsia"/>
+                <w:color w:val="000000" w:themeColor="text1"/>
+              </w:rPr>
+              <w:t>：</w:t>
+            </w:r>
+          </w:p>
+          <w:p>
+            <w:pPr>
+              <w:rPr>
+                <w:rFonts w:ascii="仿宋" w:eastAsia="仿宋" w:hAnsi="仿宋" w:hint="eastAsia"/>
+                <w:color w:val="000000" w:themeColor="text1"/>
+              </w:rPr>
+            </w:pPr>
+            <w:r>
+              <w:rPr>
+                <w:rFonts w:ascii="仿宋" w:hAnsi="仿宋" w:eastAsia="仿宋"/>
+              </w:rPr>
+              <w:t>Sak-AI答题助手是面向备考场景的Web题库平台，集题库广场、个人题库、刷题、考试、数据中心、论坛与后台管理于一体，</w:t>
+            </w:r>
+          </w:p>
+          <w:p>
+            <w:pPr>
+              <w:rPr>
+                <w:rFonts w:ascii="仿宋" w:eastAsia="仿宋" w:hAnsi="仿宋" w:hint="eastAsia"/>
+                <w:color w:val="000000" w:themeColor="text1"/>
+              </w:rPr>
+            </w:pPr>
+            <w:r>
+              <w:rPr>
+                <w:rFonts w:ascii="仿宋" w:hAnsi="仿宋" w:eastAsia="仿宋"/>
+              </w:rPr>
+              <w:t>并配套微信小程序延展移动学习场景。</w:t>
+            </w:r>
+          </w:p>
+          <w:p>
+            <w:pPr>
+              <w:rPr>
+                <w:rFonts w:ascii="仿宋" w:eastAsia="仿宋" w:hAnsi="仿宋" w:hint="eastAsia"/>
+                <w:color w:val="000000" w:themeColor="text1"/>
+              </w:rPr>
+            </w:pPr>
+          </w:p>
+          <w:p>
+            <w:pPr>
+              <w:rPr>
+                <w:rFonts w:ascii="仿宋" w:eastAsia="仿宋" w:hAnsi="仿宋" w:hint="eastAsia"/>
+                <w:color w:val="000000" w:themeColor="text1"/>
+              </w:rPr>
+            </w:pPr>
+          </w:p>
+          <w:p>
+            <w:pPr>
+              <w:rPr>
+                <w:rFonts w:ascii="仿宋" w:eastAsia="仿宋" w:hAnsi="仿宋" w:hint="eastAsia"/>
+                <w:color w:val="000000" w:themeColor="text1"/>
+              </w:rPr>
+            </w:pPr>
           </w:p>
         </w:tc>
       </w:tr>
@@ -325,30 +393,84 @@
           </w:tcPr>
           <w:p>
             <w:pPr>
-              <w:spacing w:after="0"/>
-            </w:pPr>
-            <w:r/>
-            <w:r>
-              <w:rPr>
-                <w:rFonts w:ascii="微软雅黑" w:hAnsi="微软雅黑" w:eastAsia="微软雅黑"/>
-                <w:b w:val="0"/>
-                <w:sz w:val="20"/>
-              </w:rPr>
-              <w:t>创新描述（100字以内）：</w:t>
-            </w:r>
-          </w:p>
-          <w:p>
-            <w:pPr>
-              <w:spacing w:after="0"/>
-            </w:pPr>
-            <w:r>
-              <w:rPr>
-                <w:rFonts w:ascii="微软雅黑" w:hAnsi="微软雅黑" w:eastAsia="微软雅黑"/>
-                <w:b w:val="0"/>
-                <w:sz w:val="20"/>
-              </w:rPr>
-              <w:t>作品采用Flask单仓全栈架构，实现Web与小程序共享语义；支持Docker一键部署、学习数据可视化与AI题目解析，兼顾工程化、扩展性和教学应用价值。</w:t>
-            </w:r>
+              <w:rPr>
+                <w:rFonts w:ascii="仿宋" w:eastAsia="仿宋" w:hAnsi="仿宋" w:hint="eastAsia"/>
+                <w:color w:val="000000" w:themeColor="text1"/>
+              </w:rPr>
+            </w:pPr>
+            <w:r>
+              <w:rPr>
+                <w:rFonts w:ascii="仿宋" w:eastAsia="仿宋" w:hAnsi="仿宋" w:hint="eastAsia"/>
+                <w:color w:val="000000" w:themeColor="text1"/>
+              </w:rPr>
+              <w:t>创新描述（1</w:t>
+            </w:r>
+            <w:r>
+              <w:rPr>
+                <w:rFonts w:ascii="仿宋" w:eastAsia="仿宋" w:hAnsi="仿宋"/>
+                <w:color w:val="000000" w:themeColor="text1"/>
+              </w:rPr>
+              <w:t>00</w:t>
+            </w:r>
+            <w:r>
+              <w:rPr>
+                <w:rFonts w:ascii="仿宋" w:eastAsia="仿宋" w:hAnsi="仿宋" w:hint="eastAsia"/>
+                <w:color w:val="000000" w:themeColor="text1"/>
+              </w:rPr>
+              <w:t>字以内）：</w:t>
+            </w:r>
+          </w:p>
+          <w:p>
+            <w:pPr>
+              <w:rPr>
+                <w:rFonts w:ascii="仿宋" w:eastAsia="仿宋" w:hAnsi="仿宋" w:hint="eastAsia"/>
+                <w:color w:val="000000" w:themeColor="text1"/>
+              </w:rPr>
+            </w:pPr>
+            <w:r>
+              <w:rPr>
+                <w:rFonts w:ascii="仿宋" w:hAnsi="仿宋" w:eastAsia="仿宋"/>
+              </w:rPr>
+              <w:t>作品采用Flask单仓全栈架构，实现Web与小程序共享语义；支持Docker一键部署、学习数据可视化与</w:t>
+            </w:r>
+          </w:p>
+          <w:p>
+            <w:pPr>
+              <w:rPr>
+                <w:rFonts w:ascii="仿宋" w:eastAsia="仿宋" w:hAnsi="仿宋" w:hint="eastAsia"/>
+                <w:color w:val="000000" w:themeColor="text1"/>
+              </w:rPr>
+            </w:pPr>
+            <w:r>
+              <w:rPr>
+                <w:rFonts w:ascii="仿宋" w:hAnsi="仿宋" w:eastAsia="仿宋"/>
+              </w:rPr>
+              <w:t>AI题目解析，兼顾工程化、扩展性和教学应用价值。</w:t>
+            </w:r>
+          </w:p>
+          <w:p>
+            <w:pPr>
+              <w:rPr>
+                <w:rFonts w:ascii="仿宋" w:eastAsia="仿宋" w:hAnsi="仿宋" w:hint="eastAsia"/>
+                <w:color w:val="000000" w:themeColor="text1"/>
+              </w:rPr>
+            </w:pPr>
+          </w:p>
+          <w:p>
+            <w:pPr>
+              <w:rPr>
+                <w:rFonts w:ascii="仿宋" w:eastAsia="仿宋" w:hAnsi="仿宋" w:hint="eastAsia"/>
+                <w:color w:val="000000" w:themeColor="text1"/>
+              </w:rPr>
+            </w:pPr>
+          </w:p>
+          <w:p>
+            <w:pPr>
+              <w:rPr>
+                <w:rFonts w:ascii="仿宋" w:eastAsia="仿宋" w:hAnsi="仿宋" w:hint="eastAsia"/>
+                <w:color w:val="000000" w:themeColor="text1"/>
+              </w:rPr>
+            </w:pPr>
           </w:p>
         </w:tc>
       </w:tr>
@@ -363,56 +485,139 @@
           </w:tcPr>
           <w:p>
             <w:pPr>
-              <w:spacing w:after="0"/>
-            </w:pPr>
-            <w:r/>
-            <w:r>
-              <w:rPr>
-                <w:rFonts w:ascii="微软雅黑" w:hAnsi="微软雅黑" w:eastAsia="微软雅黑"/>
-                <w:b w:val="0"/>
-                <w:sz w:val="18"/>
+              <w:rPr>
+                <w:rFonts w:ascii="仿宋" w:eastAsia="仿宋" w:hAnsi="仿宋" w:hint="eastAsia"/>
+                <w:color w:val="000000" w:themeColor="text1"/>
+              </w:rPr>
+            </w:pPr>
+            <w:r>
+              <w:rPr>
+                <w:rFonts w:ascii="仿宋" w:eastAsia="仿宋" w:hAnsi="仿宋" w:hint="eastAsia"/>
+                <w:color w:val="000000" w:themeColor="text1"/>
               </w:rPr>
               <w:t>特别说明</w:t>
             </w:r>
           </w:p>
           <w:p>
             <w:pPr>
-              <w:spacing w:after="0"/>
-            </w:pPr>
-            <w:r>
-              <w:rPr>
-                <w:rFonts w:ascii="微软雅黑" w:hAnsi="微软雅黑" w:eastAsia="微软雅黑"/>
-                <w:b w:val="0"/>
-                <w:sz w:val="18"/>
-              </w:rPr>
-              <w:t>1. 本作品不含涉及疆域展示的地图内容。</w:t>
-            </w:r>
-          </w:p>
-          <w:p>
-            <w:pPr>
-              <w:spacing w:after="0"/>
-            </w:pPr>
-            <w:r>
-              <w:rPr>
-                <w:rFonts w:ascii="微软雅黑" w:hAnsi="微软雅黑" w:eastAsia="微软雅黑"/>
-                <w:b w:val="0"/>
-                <w:sz w:val="18"/>
-              </w:rPr>
-              <w:t>2. 作品基于团队自研题库平台持续完善，本次参赛重点整理并强化 Web 主体演示链路，以及题库广场、个人题库、数据中心、论坛与后台等核心模块的闭环展示。</w:t>
-            </w:r>
-          </w:p>
-          <w:p>
-            <w:pPr>
-              <w:spacing w:after="0"/>
-            </w:pPr>
-            <w:r>
-              <w:rPr>
-                <w:rFonts w:ascii="微软雅黑" w:hAnsi="微软雅黑" w:eastAsia="微软雅黑"/>
-                <w:b w:val="0"/>
-                <w:sz w:val="18"/>
-              </w:rPr>
-              <w:t>3. 作品功能中集成 AI 题目解析能力，采用 DashScope 兼容接口生成题目解析文本；AI 仅作为局部辅助能力，不替代题库管理、练习、考试和数据统计等核心业务逻辑。</w:t>
-            </w:r>
+              <w:rPr>
+                <w:rFonts w:ascii="仿宋" w:eastAsia="仿宋" w:hAnsi="仿宋" w:hint="eastAsia"/>
+                <w:color w:val="000000" w:themeColor="text1"/>
+              </w:rPr>
+            </w:pPr>
+            <w:r>
+              <w:rPr>
+                <w:rFonts w:ascii="仿宋" w:eastAsia="仿宋" w:hAnsi="仿宋" w:hint="eastAsia"/>
+                <w:color w:val="000000" w:themeColor="text1"/>
+              </w:rPr>
+              <w:t>1.本作品不含涉及疆域展示的地图内容。</w:t>
+            </w:r>
+            <w:r>
+              <w:rPr>
+                <w:rFonts w:ascii="仿宋" w:eastAsia="仿宋" w:hAnsi="仿宋"/>
+                <w:color w:val="000000" w:themeColor="text1"/>
+              </w:rPr>
+            </w:r>
+            <w:r>
+              <w:rPr>
+                <w:rFonts w:ascii="仿宋" w:eastAsia="仿宋" w:hAnsi="仿宋" w:hint="eastAsia"/>
+                <w:color w:val="000000" w:themeColor="text1"/>
+              </w:rPr>
+            </w:r>
+            <w:r>
+              <w:rPr>
+                <w:rFonts w:ascii="仿宋" w:eastAsia="仿宋" w:hAnsi="仿宋" w:hint="eastAsia"/>
+                <w:color w:val="000000" w:themeColor="text1"/>
+              </w:rPr>
+            </w:r>
+          </w:p>
+          <w:p>
+            <w:pPr>
+              <w:rPr>
+                <w:rFonts w:ascii="仿宋" w:eastAsia="仿宋" w:hAnsi="仿宋" w:hint="eastAsia"/>
+                <w:color w:val="000000" w:themeColor="text1"/>
+              </w:rPr>
+            </w:pPr>
+            <w:r>
+              <w:rPr>
+                <w:rFonts w:ascii="仿宋" w:eastAsia="仿宋" w:hAnsi="仿宋"/>
+                <w:color w:val="000000" w:themeColor="text1"/>
+              </w:rPr>
+              <w:t>2.作品基于团队自研平台持续完善，本次参赛重点整理并强化Web主体演示链路。</w:t>
+            </w:r>
+            <w:r>
+              <w:rPr>
+                <w:rFonts w:ascii="仿宋" w:eastAsia="仿宋" w:hAnsi="仿宋" w:hint="eastAsia"/>
+                <w:color w:val="000000" w:themeColor="text1"/>
+              </w:rPr>
+            </w:r>
+          </w:p>
+          <w:p>
+            <w:pPr>
+              <w:rPr>
+                <w:rFonts w:ascii="仿宋" w:eastAsia="仿宋" w:hAnsi="仿宋" w:hint="eastAsia"/>
+                <w:color w:val="000000" w:themeColor="text1"/>
+              </w:rPr>
+            </w:pPr>
+            <w:r>
+              <w:rPr>
+                <w:rFonts w:ascii="仿宋" w:eastAsia="仿宋" w:hAnsi="仿宋" w:hint="eastAsia"/>
+                <w:color w:val="000000" w:themeColor="text1"/>
+              </w:rPr>
+              <w:t>3.作品功能中集成AI题目解析能力，采用DashScope兼容接口生成解析文本。</w:t>
+            </w:r>
+            <w:r>
+              <w:rPr>
+                <w:rFonts w:ascii="仿宋" w:eastAsia="仿宋" w:hAnsi="仿宋"/>
+                <w:color w:val="000000" w:themeColor="text1"/>
+              </w:rPr>
+            </w:r>
+            <w:r>
+              <w:rPr>
+                <w:rFonts w:ascii="仿宋" w:eastAsia="仿宋" w:hAnsi="仿宋" w:hint="eastAsia"/>
+                <w:color w:val="000000" w:themeColor="text1"/>
+              </w:rPr>
+            </w:r>
+          </w:p>
+          <w:p>
+            <w:pPr>
+              <w:rPr>
+                <w:rFonts w:ascii="仿宋" w:eastAsia="仿宋" w:hAnsi="仿宋" w:hint="eastAsia"/>
+                <w:color w:val="000000" w:themeColor="text1"/>
+              </w:rPr>
+            </w:pPr>
+          </w:p>
+          <w:p>
+            <w:pPr>
+              <w:rPr>
+                <w:rFonts w:ascii="仿宋" w:eastAsia="仿宋" w:hAnsi="仿宋" w:hint="eastAsia"/>
+                <w:color w:val="000000" w:themeColor="text1"/>
+              </w:rPr>
+            </w:pPr>
+          </w:p>
+          <w:p>
+            <w:pPr>
+              <w:rPr>
+                <w:rFonts w:ascii="仿宋" w:eastAsia="仿宋" w:hAnsi="仿宋" w:hint="eastAsia"/>
+                <w:color w:val="000000" w:themeColor="text1"/>
+              </w:rPr>
+            </w:pPr>
+          </w:p>
+          <w:p>
+            <w:pPr>
+              <w:rPr>
+                <w:rFonts w:ascii="仿宋" w:eastAsia="仿宋" w:hAnsi="仿宋" w:hint="eastAsia"/>
+                <w:color w:val="000000" w:themeColor="text1"/>
+              </w:rPr>
+            </w:pPr>
+          </w:p>
+          <w:p>
+            <w:pPr>
+              <w:rPr>
+                <w:rFonts w:ascii="仿宋" w:eastAsia="仿宋" w:hAnsi="仿宋" w:hint="eastAsia"/>
+                <w:color w:val="000000" w:themeColor="text1"/>
+              </w:rPr>
+            </w:pPr>
           </w:p>
         </w:tc>
       </w:tr>
@@ -566,14 +771,16 @@
           </w:tcPr>
           <w:p>
             <w:pPr>
-              <w:spacing w:after="0"/>
-            </w:pPr>
-            <w:r/>
-            <w:r>
-              <w:rPr>
-                <w:rFonts w:ascii="微软雅黑" w:hAnsi="微软雅黑" w:eastAsia="微软雅黑"/>
-                <w:b/>
-                <w:sz w:val="20"/>
+              <w:jc w:val="center"/>
+              <w:rPr>
+                <w:rFonts w:ascii="仿宋" w:eastAsia="仿宋" w:hAnsi="仿宋" w:hint="eastAsia"/>
+                <w:color w:val="000000" w:themeColor="text1"/>
+              </w:rPr>
+            </w:pPr>
+            <w:r>
+              <w:rPr>
+                <w:rFonts w:ascii="仿宋" w:eastAsia="仿宋" w:hAnsi="仿宋" w:hint="eastAsia"/>
+                <w:color w:val="000000" w:themeColor="text1"/>
               </w:rPr>
               <w:t>王为硕</w:t>
             </w:r>
@@ -587,14 +794,16 @@
           </w:tcPr>
           <w:p>
             <w:pPr>
-              <w:spacing w:after="0"/>
-            </w:pPr>
-            <w:r/>
-            <w:r>
-              <w:rPr>
-                <w:rFonts w:ascii="微软雅黑" w:hAnsi="微软雅黑" w:eastAsia="微软雅黑"/>
-                <w:b/>
-                <w:sz w:val="20"/>
+              <w:jc w:val="center"/>
+              <w:rPr>
+                <w:rFonts w:ascii="仿宋" w:eastAsia="仿宋" w:hAnsi="仿宋" w:hint="eastAsia"/>
+                <w:color w:val="000000" w:themeColor="text1"/>
+              </w:rPr>
+            </w:pPr>
+            <w:r>
+              <w:rPr>
+                <w:rFonts w:ascii="仿宋" w:eastAsia="仿宋" w:hAnsi="仿宋" w:hint="eastAsia"/>
+                <w:color w:val="000000" w:themeColor="text1"/>
               </w:rPr>
               <w:t>队员B</w:t>
             </w:r>
@@ -608,14 +817,16 @@
           </w:tcPr>
           <w:p>
             <w:pPr>
-              <w:spacing w:after="0"/>
-            </w:pPr>
-            <w:r/>
-            <w:r>
-              <w:rPr>
-                <w:rFonts w:ascii="微软雅黑" w:hAnsi="微软雅黑" w:eastAsia="微软雅黑"/>
-                <w:b w:val="0"/>
-                <w:sz w:val="20"/>
+              <w:jc w:val="center"/>
+              <w:rPr>
+                <w:rFonts w:ascii="仿宋" w:eastAsia="仿宋" w:hAnsi="仿宋" w:hint="eastAsia"/>
+                <w:color w:val="000000" w:themeColor="text1"/>
+              </w:rPr>
+            </w:pPr>
+            <w:r>
+              <w:rPr>
+                <w:rFonts w:ascii="仿宋" w:eastAsia="仿宋" w:hAnsi="仿宋" w:hint="eastAsia"/>
+                <w:color w:val="000000" w:themeColor="text1"/>
               </w:rPr>
             </w:r>
           </w:p>
@@ -628,14 +839,16 @@
           </w:tcPr>
           <w:p>
             <w:pPr>
-              <w:spacing w:after="0"/>
-            </w:pPr>
-            <w:r/>
-            <w:r>
-              <w:rPr>
-                <w:rFonts w:ascii="微软雅黑" w:hAnsi="微软雅黑" w:eastAsia="微软雅黑"/>
-                <w:b w:val="0"/>
-                <w:sz w:val="20"/>
+              <w:jc w:val="center"/>
+              <w:rPr>
+                <w:rFonts w:ascii="仿宋" w:eastAsia="仿宋" w:hAnsi="仿宋" w:hint="eastAsia"/>
+                <w:color w:val="000000" w:themeColor="text1"/>
+              </w:rPr>
+            </w:pPr>
+            <w:r>
+              <w:rPr>
+                <w:rFonts w:ascii="仿宋" w:eastAsia="仿宋" w:hAnsi="仿宋" w:hint="eastAsia"/>
+                <w:color w:val="000000" w:themeColor="text1"/>
               </w:rPr>
             </w:r>
           </w:p>
@@ -647,14 +860,16 @@
           </w:tcPr>
           <w:p>
             <w:pPr>
-              <w:spacing w:after="0"/>
-            </w:pPr>
-            <w:r/>
-            <w:r>
-              <w:rPr>
-                <w:rFonts w:ascii="微软雅黑" w:hAnsi="微软雅黑" w:eastAsia="微软雅黑"/>
-                <w:b w:val="0"/>
-                <w:sz w:val="20"/>
+              <w:jc w:val="center"/>
+              <w:rPr>
+                <w:rFonts w:ascii="仿宋" w:eastAsia="仿宋" w:hAnsi="仿宋" w:hint="eastAsia"/>
+                <w:color w:val="000000" w:themeColor="text1"/>
+              </w:rPr>
+            </w:pPr>
+            <w:r>
+              <w:rPr>
+                <w:rFonts w:ascii="仿宋" w:eastAsia="仿宋" w:hAnsi="仿宋" w:hint="eastAsia"/>
+                <w:color w:val="000000" w:themeColor="text1"/>
               </w:rPr>
             </w:r>
           </w:p>
@@ -695,14 +910,17 @@
           </w:tcPr>
           <w:p>
             <w:pPr>
-              <w:spacing w:after="0"/>
-            </w:pPr>
-            <w:r/>
-            <w:r>
-              <w:rPr>
-                <w:rFonts w:ascii="微软雅黑" w:hAnsi="微软雅黑" w:eastAsia="微软雅黑"/>
-                <w:b w:val="0"/>
-                <w:sz w:val="20"/>
+              <w:ind w:rightChars="116" w:right="244"/>
+              <w:jc w:val="right"/>
+              <w:rPr>
+                <w:rFonts w:ascii="仿宋" w:eastAsia="仿宋" w:hAnsi="仿宋" w:hint="eastAsia"/>
+                <w:color w:val="000000" w:themeColor="text1"/>
+              </w:rPr>
+            </w:pPr>
+            <w:r>
+              <w:rPr>
+                <w:rFonts w:ascii="仿宋" w:eastAsia="仿宋" w:hAnsi="仿宋" w:hint="eastAsia"/>
+                <w:color w:val="000000" w:themeColor="text1"/>
               </w:rPr>
               <w:t>90%</w:t>
             </w:r>
@@ -716,14 +934,17 @@
           </w:tcPr>
           <w:p>
             <w:pPr>
-              <w:spacing w:after="0"/>
-            </w:pPr>
-            <w:r/>
-            <w:r>
-              <w:rPr>
-                <w:rFonts w:ascii="微软雅黑" w:hAnsi="微软雅黑" w:eastAsia="微软雅黑"/>
-                <w:b w:val="0"/>
-                <w:sz w:val="20"/>
+              <w:ind w:rightChars="116" w:right="244"/>
+              <w:jc w:val="right"/>
+              <w:rPr>
+                <w:rFonts w:ascii="仿宋" w:eastAsia="仿宋" w:hAnsi="仿宋" w:hint="eastAsia"/>
+                <w:color w:val="000000" w:themeColor="text1"/>
+              </w:rPr>
+            </w:pPr>
+            <w:r>
+              <w:rPr>
+                <w:rFonts w:ascii="仿宋" w:eastAsia="仿宋" w:hAnsi="仿宋" w:hint="eastAsia"/>
+                <w:color w:val="000000" w:themeColor="text1"/>
               </w:rPr>
               <w:t>10%</w:t>
             </w:r>
@@ -737,14 +958,17 @@
           </w:tcPr>
           <w:p>
             <w:pPr>
-              <w:spacing w:after="0"/>
-            </w:pPr>
-            <w:r/>
-            <w:r>
-              <w:rPr>
-                <w:rFonts w:ascii="微软雅黑" w:hAnsi="微软雅黑" w:eastAsia="微软雅黑"/>
-                <w:b w:val="0"/>
-                <w:sz w:val="20"/>
+              <w:ind w:rightChars="116" w:right="244"/>
+              <w:jc w:val="right"/>
+              <w:rPr>
+                <w:rFonts w:ascii="仿宋" w:eastAsia="仿宋" w:hAnsi="仿宋" w:hint="eastAsia"/>
+                <w:color w:val="000000" w:themeColor="text1"/>
+              </w:rPr>
+            </w:pPr>
+            <w:r>
+              <w:rPr>
+                <w:rFonts w:ascii="仿宋" w:eastAsia="仿宋" w:hAnsi="仿宋" w:hint="eastAsia"/>
+                <w:color w:val="000000" w:themeColor="text1"/>
               </w:rPr>
             </w:r>
           </w:p>
@@ -757,14 +981,17 @@
           </w:tcPr>
           <w:p>
             <w:pPr>
-              <w:spacing w:after="0"/>
-            </w:pPr>
-            <w:r/>
-            <w:r>
-              <w:rPr>
-                <w:rFonts w:ascii="微软雅黑" w:hAnsi="微软雅黑" w:eastAsia="微软雅黑"/>
-                <w:b w:val="0"/>
-                <w:sz w:val="20"/>
+              <w:ind w:rightChars="116" w:right="244"/>
+              <w:jc w:val="right"/>
+              <w:rPr>
+                <w:rFonts w:ascii="仿宋" w:eastAsia="仿宋" w:hAnsi="仿宋" w:hint="eastAsia"/>
+                <w:color w:val="000000" w:themeColor="text1"/>
+              </w:rPr>
+            </w:pPr>
+            <w:r>
+              <w:rPr>
+                <w:rFonts w:ascii="仿宋" w:eastAsia="仿宋" w:hAnsi="仿宋" w:hint="eastAsia"/>
+                <w:color w:val="000000" w:themeColor="text1"/>
               </w:rPr>
             </w:r>
           </w:p>
@@ -776,14 +1003,17 @@
           </w:tcPr>
           <w:p>
             <w:pPr>
-              <w:spacing w:after="0"/>
-            </w:pPr>
-            <w:r/>
-            <w:r>
-              <w:rPr>
-                <w:rFonts w:ascii="微软雅黑" w:hAnsi="微软雅黑" w:eastAsia="微软雅黑"/>
-                <w:b w:val="0"/>
-                <w:sz w:val="20"/>
+              <w:ind w:rightChars="116" w:right="244"/>
+              <w:jc w:val="right"/>
+              <w:rPr>
+                <w:rFonts w:ascii="仿宋" w:eastAsia="仿宋" w:hAnsi="仿宋" w:hint="eastAsia"/>
+                <w:color w:val="000000" w:themeColor="text1"/>
+              </w:rPr>
+            </w:pPr>
+            <w:r>
+              <w:rPr>
+                <w:rFonts w:ascii="仿宋" w:eastAsia="仿宋" w:hAnsi="仿宋" w:hint="eastAsia"/>
+                <w:color w:val="000000" w:themeColor="text1"/>
               </w:rPr>
             </w:r>
           </w:p>
@@ -824,14 +1054,17 @@
           </w:tcPr>
           <w:p>
             <w:pPr>
-              <w:spacing w:after="0"/>
-            </w:pPr>
-            <w:r/>
-            <w:r>
-              <w:rPr>
-                <w:rFonts w:ascii="微软雅黑" w:hAnsi="微软雅黑" w:eastAsia="微软雅黑"/>
-                <w:b w:val="0"/>
-                <w:sz w:val="20"/>
+              <w:ind w:rightChars="116" w:right="244"/>
+              <w:jc w:val="right"/>
+              <w:rPr>
+                <w:rFonts w:ascii="仿宋" w:eastAsia="仿宋" w:hAnsi="仿宋" w:hint="eastAsia"/>
+                <w:color w:val="000000" w:themeColor="text1"/>
+              </w:rPr>
+            </w:pPr>
+            <w:r>
+              <w:rPr>
+                <w:rFonts w:ascii="仿宋" w:eastAsia="仿宋" w:hAnsi="仿宋" w:hint="eastAsia"/>
+                <w:color w:val="000000" w:themeColor="text1"/>
               </w:rPr>
               <w:t>90%</w:t>
             </w:r>
@@ -845,14 +1078,17 @@
           </w:tcPr>
           <w:p>
             <w:pPr>
-              <w:spacing w:after="0"/>
-            </w:pPr>
-            <w:r/>
-            <w:r>
-              <w:rPr>
-                <w:rFonts w:ascii="微软雅黑" w:hAnsi="微软雅黑" w:eastAsia="微软雅黑"/>
-                <w:b w:val="0"/>
-                <w:sz w:val="20"/>
+              <w:ind w:rightChars="116" w:right="244"/>
+              <w:jc w:val="right"/>
+              <w:rPr>
+                <w:rFonts w:ascii="仿宋" w:eastAsia="仿宋" w:hAnsi="仿宋" w:hint="eastAsia"/>
+                <w:color w:val="000000" w:themeColor="text1"/>
+              </w:rPr>
+            </w:pPr>
+            <w:r>
+              <w:rPr>
+                <w:rFonts w:ascii="仿宋" w:eastAsia="仿宋" w:hAnsi="仿宋" w:hint="eastAsia"/>
+                <w:color w:val="000000" w:themeColor="text1"/>
               </w:rPr>
               <w:t>10%</w:t>
             </w:r>
@@ -866,14 +1102,17 @@
           </w:tcPr>
           <w:p>
             <w:pPr>
-              <w:spacing w:after="0"/>
-            </w:pPr>
-            <w:r/>
-            <w:r>
-              <w:rPr>
-                <w:rFonts w:ascii="微软雅黑" w:hAnsi="微软雅黑" w:eastAsia="微软雅黑"/>
-                <w:b w:val="0"/>
-                <w:sz w:val="20"/>
+              <w:ind w:rightChars="116" w:right="244"/>
+              <w:jc w:val="right"/>
+              <w:rPr>
+                <w:rFonts w:ascii="仿宋" w:eastAsia="仿宋" w:hAnsi="仿宋" w:hint="eastAsia"/>
+                <w:color w:val="000000" w:themeColor="text1"/>
+              </w:rPr>
+            </w:pPr>
+            <w:r>
+              <w:rPr>
+                <w:rFonts w:ascii="仿宋" w:eastAsia="仿宋" w:hAnsi="仿宋" w:hint="eastAsia"/>
+                <w:color w:val="000000" w:themeColor="text1"/>
               </w:rPr>
             </w:r>
           </w:p>
@@ -886,14 +1125,17 @@
           </w:tcPr>
           <w:p>
             <w:pPr>
-              <w:spacing w:after="0"/>
-            </w:pPr>
-            <w:r/>
-            <w:r>
-              <w:rPr>
-                <w:rFonts w:ascii="微软雅黑" w:hAnsi="微软雅黑" w:eastAsia="微软雅黑"/>
-                <w:b w:val="0"/>
-                <w:sz w:val="20"/>
+              <w:ind w:rightChars="116" w:right="244"/>
+              <w:jc w:val="right"/>
+              <w:rPr>
+                <w:rFonts w:ascii="仿宋" w:eastAsia="仿宋" w:hAnsi="仿宋" w:hint="eastAsia"/>
+                <w:color w:val="000000" w:themeColor="text1"/>
+              </w:rPr>
+            </w:pPr>
+            <w:r>
+              <w:rPr>
+                <w:rFonts w:ascii="仿宋" w:eastAsia="仿宋" w:hAnsi="仿宋" w:hint="eastAsia"/>
+                <w:color w:val="000000" w:themeColor="text1"/>
               </w:rPr>
             </w:r>
           </w:p>
@@ -905,14 +1147,17 @@
           </w:tcPr>
           <w:p>
             <w:pPr>
-              <w:spacing w:after="0"/>
-            </w:pPr>
-            <w:r/>
-            <w:r>
-              <w:rPr>
-                <w:rFonts w:ascii="微软雅黑" w:hAnsi="微软雅黑" w:eastAsia="微软雅黑"/>
-                <w:b w:val="0"/>
-                <w:sz w:val="20"/>
+              <w:ind w:rightChars="116" w:right="244"/>
+              <w:jc w:val="right"/>
+              <w:rPr>
+                <w:rFonts w:ascii="仿宋" w:eastAsia="仿宋" w:hAnsi="仿宋" w:hint="eastAsia"/>
+                <w:color w:val="000000" w:themeColor="text1"/>
+              </w:rPr>
+            </w:pPr>
+            <w:r>
+              <w:rPr>
+                <w:rFonts w:ascii="仿宋" w:eastAsia="仿宋" w:hAnsi="仿宋" w:hint="eastAsia"/>
+                <w:color w:val="000000" w:themeColor="text1"/>
               </w:rPr>
             </w:r>
           </w:p>
@@ -953,14 +1198,17 @@
           </w:tcPr>
           <w:p>
             <w:pPr>
-              <w:spacing w:after="0"/>
-            </w:pPr>
-            <w:r/>
-            <w:r>
-              <w:rPr>
-                <w:rFonts w:ascii="微软雅黑" w:hAnsi="微软雅黑" w:eastAsia="微软雅黑"/>
-                <w:b w:val="0"/>
-                <w:sz w:val="20"/>
+              <w:ind w:rightChars="116" w:right="244"/>
+              <w:jc w:val="right"/>
+              <w:rPr>
+                <w:rFonts w:ascii="仿宋" w:eastAsia="仿宋" w:hAnsi="仿宋" w:hint="eastAsia"/>
+                <w:color w:val="000000" w:themeColor="text1"/>
+              </w:rPr>
+            </w:pPr>
+            <w:r>
+              <w:rPr>
+                <w:rFonts w:ascii="仿宋" w:eastAsia="仿宋" w:hAnsi="仿宋" w:hint="eastAsia"/>
+                <w:color w:val="000000" w:themeColor="text1"/>
               </w:rPr>
               <w:t>90%</w:t>
             </w:r>
@@ -974,14 +1222,17 @@
           </w:tcPr>
           <w:p>
             <w:pPr>
-              <w:spacing w:after="0"/>
-            </w:pPr>
-            <w:r/>
-            <w:r>
-              <w:rPr>
-                <w:rFonts w:ascii="微软雅黑" w:hAnsi="微软雅黑" w:eastAsia="微软雅黑"/>
-                <w:b w:val="0"/>
-                <w:sz w:val="20"/>
+              <w:ind w:rightChars="116" w:right="244"/>
+              <w:jc w:val="right"/>
+              <w:rPr>
+                <w:rFonts w:ascii="仿宋" w:eastAsia="仿宋" w:hAnsi="仿宋" w:hint="eastAsia"/>
+                <w:color w:val="000000" w:themeColor="text1"/>
+              </w:rPr>
+            </w:pPr>
+            <w:r>
+              <w:rPr>
+                <w:rFonts w:ascii="仿宋" w:eastAsia="仿宋" w:hAnsi="仿宋" w:hint="eastAsia"/>
+                <w:color w:val="000000" w:themeColor="text1"/>
               </w:rPr>
               <w:t>10%</w:t>
             </w:r>
@@ -995,14 +1246,17 @@
           </w:tcPr>
           <w:p>
             <w:pPr>
-              <w:spacing w:after="0"/>
-            </w:pPr>
-            <w:r/>
-            <w:r>
-              <w:rPr>
-                <w:rFonts w:ascii="微软雅黑" w:hAnsi="微软雅黑" w:eastAsia="微软雅黑"/>
-                <w:b w:val="0"/>
-                <w:sz w:val="20"/>
+              <w:ind w:rightChars="116" w:right="244"/>
+              <w:jc w:val="right"/>
+              <w:rPr>
+                <w:rFonts w:ascii="仿宋" w:eastAsia="仿宋" w:hAnsi="仿宋" w:hint="eastAsia"/>
+                <w:color w:val="000000" w:themeColor="text1"/>
+              </w:rPr>
+            </w:pPr>
+            <w:r>
+              <w:rPr>
+                <w:rFonts w:ascii="仿宋" w:eastAsia="仿宋" w:hAnsi="仿宋" w:hint="eastAsia"/>
+                <w:color w:val="000000" w:themeColor="text1"/>
               </w:rPr>
             </w:r>
           </w:p>
@@ -1015,14 +1269,17 @@
           </w:tcPr>
           <w:p>
             <w:pPr>
-              <w:spacing w:after="0"/>
-            </w:pPr>
-            <w:r/>
-            <w:r>
-              <w:rPr>
-                <w:rFonts w:ascii="微软雅黑" w:hAnsi="微软雅黑" w:eastAsia="微软雅黑"/>
-                <w:b w:val="0"/>
-                <w:sz w:val="20"/>
+              <w:ind w:rightChars="116" w:right="244"/>
+              <w:jc w:val="right"/>
+              <w:rPr>
+                <w:rFonts w:ascii="仿宋" w:eastAsia="仿宋" w:hAnsi="仿宋" w:hint="eastAsia"/>
+                <w:color w:val="000000" w:themeColor="text1"/>
+              </w:rPr>
+            </w:pPr>
+            <w:r>
+              <w:rPr>
+                <w:rFonts w:ascii="仿宋" w:eastAsia="仿宋" w:hAnsi="仿宋" w:hint="eastAsia"/>
+                <w:color w:val="000000" w:themeColor="text1"/>
               </w:rPr>
             </w:r>
           </w:p>
@@ -1034,14 +1291,17 @@
           </w:tcPr>
           <w:p>
             <w:pPr>
-              <w:spacing w:after="0"/>
-            </w:pPr>
-            <w:r/>
-            <w:r>
-              <w:rPr>
-                <w:rFonts w:ascii="微软雅黑" w:hAnsi="微软雅黑" w:eastAsia="微软雅黑"/>
-                <w:b w:val="0"/>
-                <w:sz w:val="20"/>
+              <w:ind w:rightChars="116" w:right="244"/>
+              <w:jc w:val="right"/>
+              <w:rPr>
+                <w:rFonts w:ascii="仿宋" w:eastAsia="仿宋" w:hAnsi="仿宋" w:hint="eastAsia"/>
+                <w:color w:val="000000" w:themeColor="text1"/>
+              </w:rPr>
+            </w:pPr>
+            <w:r>
+              <w:rPr>
+                <w:rFonts w:ascii="仿宋" w:eastAsia="仿宋" w:hAnsi="仿宋" w:hint="eastAsia"/>
+                <w:color w:val="000000" w:themeColor="text1"/>
               </w:rPr>
             </w:r>
           </w:p>
@@ -1082,14 +1342,17 @@
           </w:tcPr>
           <w:p>
             <w:pPr>
-              <w:spacing w:after="0"/>
-            </w:pPr>
-            <w:r/>
-            <w:r>
-              <w:rPr>
-                <w:rFonts w:ascii="微软雅黑" w:hAnsi="微软雅黑" w:eastAsia="微软雅黑"/>
-                <w:b w:val="0"/>
-                <w:sz w:val="20"/>
+              <w:ind w:rightChars="116" w:right="244"/>
+              <w:jc w:val="right"/>
+              <w:rPr>
+                <w:rFonts w:ascii="仿宋" w:eastAsia="仿宋" w:hAnsi="仿宋" w:hint="eastAsia"/>
+                <w:color w:val="000000" w:themeColor="text1"/>
+              </w:rPr>
+            </w:pPr>
+            <w:r>
+              <w:rPr>
+                <w:rFonts w:ascii="仿宋" w:eastAsia="仿宋" w:hAnsi="仿宋" w:hint="eastAsia"/>
+                <w:color w:val="000000" w:themeColor="text1"/>
               </w:rPr>
               <w:t>90%</w:t>
             </w:r>
@@ -1103,14 +1366,17 @@
           </w:tcPr>
           <w:p>
             <w:pPr>
-              <w:spacing w:after="0"/>
-            </w:pPr>
-            <w:r/>
-            <w:r>
-              <w:rPr>
-                <w:rFonts w:ascii="微软雅黑" w:hAnsi="微软雅黑" w:eastAsia="微软雅黑"/>
-                <w:b w:val="0"/>
-                <w:sz w:val="20"/>
+              <w:ind w:rightChars="116" w:right="244"/>
+              <w:jc w:val="right"/>
+              <w:rPr>
+                <w:rFonts w:ascii="仿宋" w:eastAsia="仿宋" w:hAnsi="仿宋" w:hint="eastAsia"/>
+                <w:color w:val="000000" w:themeColor="text1"/>
+              </w:rPr>
+            </w:pPr>
+            <w:r>
+              <w:rPr>
+                <w:rFonts w:ascii="仿宋" w:eastAsia="仿宋" w:hAnsi="仿宋" w:hint="eastAsia"/>
+                <w:color w:val="000000" w:themeColor="text1"/>
               </w:rPr>
               <w:t>10%</w:t>
             </w:r>
@@ -1124,14 +1390,17 @@
           </w:tcPr>
           <w:p>
             <w:pPr>
-              <w:spacing w:after="0"/>
-            </w:pPr>
-            <w:r/>
-            <w:r>
-              <w:rPr>
-                <w:rFonts w:ascii="微软雅黑" w:hAnsi="微软雅黑" w:eastAsia="微软雅黑"/>
-                <w:b w:val="0"/>
-                <w:sz w:val="20"/>
+              <w:ind w:rightChars="116" w:right="244"/>
+              <w:jc w:val="right"/>
+              <w:rPr>
+                <w:rFonts w:ascii="仿宋" w:eastAsia="仿宋" w:hAnsi="仿宋" w:hint="eastAsia"/>
+                <w:color w:val="000000" w:themeColor="text1"/>
+              </w:rPr>
+            </w:pPr>
+            <w:r>
+              <w:rPr>
+                <w:rFonts w:ascii="仿宋" w:eastAsia="仿宋" w:hAnsi="仿宋" w:hint="eastAsia"/>
+                <w:color w:val="000000" w:themeColor="text1"/>
               </w:rPr>
             </w:r>
           </w:p>
@@ -1144,14 +1413,17 @@
           </w:tcPr>
           <w:p>
             <w:pPr>
-              <w:spacing w:after="0"/>
-            </w:pPr>
-            <w:r/>
-            <w:r>
-              <w:rPr>
-                <w:rFonts w:ascii="微软雅黑" w:hAnsi="微软雅黑" w:eastAsia="微软雅黑"/>
-                <w:b w:val="0"/>
-                <w:sz w:val="20"/>
+              <w:ind w:rightChars="116" w:right="244"/>
+              <w:jc w:val="right"/>
+              <w:rPr>
+                <w:rFonts w:ascii="仿宋" w:eastAsia="仿宋" w:hAnsi="仿宋" w:hint="eastAsia"/>
+                <w:color w:val="000000" w:themeColor="text1"/>
+              </w:rPr>
+            </w:pPr>
+            <w:r>
+              <w:rPr>
+                <w:rFonts w:ascii="仿宋" w:eastAsia="仿宋" w:hAnsi="仿宋" w:hint="eastAsia"/>
+                <w:color w:val="000000" w:themeColor="text1"/>
               </w:rPr>
             </w:r>
           </w:p>
@@ -1163,14 +1435,17 @@
           </w:tcPr>
           <w:p>
             <w:pPr>
-              <w:spacing w:after="0"/>
-            </w:pPr>
-            <w:r/>
-            <w:r>
-              <w:rPr>
-                <w:rFonts w:ascii="微软雅黑" w:hAnsi="微软雅黑" w:eastAsia="微软雅黑"/>
-                <w:b w:val="0"/>
-                <w:sz w:val="20"/>
+              <w:ind w:rightChars="116" w:right="244"/>
+              <w:jc w:val="right"/>
+              <w:rPr>
+                <w:rFonts w:ascii="仿宋" w:eastAsia="仿宋" w:hAnsi="仿宋" w:hint="eastAsia"/>
+                <w:color w:val="000000" w:themeColor="text1"/>
+              </w:rPr>
+            </w:pPr>
+            <w:r>
+              <w:rPr>
+                <w:rFonts w:ascii="仿宋" w:eastAsia="仿宋" w:hAnsi="仿宋" w:hint="eastAsia"/>
+                <w:color w:val="000000" w:themeColor="text1"/>
               </w:rPr>
             </w:r>
           </w:p>
@@ -1211,14 +1486,17 @@
           </w:tcPr>
           <w:p>
             <w:pPr>
-              <w:spacing w:after="0"/>
-            </w:pPr>
-            <w:r/>
-            <w:r>
-              <w:rPr>
-                <w:rFonts w:ascii="微软雅黑" w:hAnsi="微软雅黑" w:eastAsia="微软雅黑"/>
-                <w:b w:val="0"/>
-                <w:sz w:val="20"/>
+              <w:ind w:rightChars="116" w:right="244"/>
+              <w:jc w:val="right"/>
+              <w:rPr>
+                <w:rFonts w:ascii="仿宋" w:eastAsia="仿宋" w:hAnsi="仿宋" w:hint="eastAsia"/>
+                <w:color w:val="000000" w:themeColor="text1"/>
+              </w:rPr>
+            </w:pPr>
+            <w:r>
+              <w:rPr>
+                <w:rFonts w:ascii="仿宋" w:eastAsia="仿宋" w:hAnsi="仿宋" w:hint="eastAsia"/>
+                <w:color w:val="000000" w:themeColor="text1"/>
               </w:rPr>
               <w:t>90%</w:t>
             </w:r>
@@ -1232,14 +1510,17 @@
           </w:tcPr>
           <w:p>
             <w:pPr>
-              <w:spacing w:after="0"/>
-            </w:pPr>
-            <w:r/>
-            <w:r>
-              <w:rPr>
-                <w:rFonts w:ascii="微软雅黑" w:hAnsi="微软雅黑" w:eastAsia="微软雅黑"/>
-                <w:b w:val="0"/>
-                <w:sz w:val="20"/>
+              <w:ind w:rightChars="116" w:right="244"/>
+              <w:jc w:val="right"/>
+              <w:rPr>
+                <w:rFonts w:ascii="仿宋" w:eastAsia="仿宋" w:hAnsi="仿宋" w:hint="eastAsia"/>
+                <w:color w:val="000000" w:themeColor="text1"/>
+              </w:rPr>
+            </w:pPr>
+            <w:r>
+              <w:rPr>
+                <w:rFonts w:ascii="仿宋" w:eastAsia="仿宋" w:hAnsi="仿宋" w:hint="eastAsia"/>
+                <w:color w:val="000000" w:themeColor="text1"/>
               </w:rPr>
               <w:t>10%</w:t>
             </w:r>
@@ -1253,14 +1534,17 @@
           </w:tcPr>
           <w:p>
             <w:pPr>
-              <w:spacing w:after="0"/>
-            </w:pPr>
-            <w:r/>
-            <w:r>
-              <w:rPr>
-                <w:rFonts w:ascii="微软雅黑" w:hAnsi="微软雅黑" w:eastAsia="微软雅黑"/>
-                <w:b w:val="0"/>
-                <w:sz w:val="20"/>
+              <w:ind w:rightChars="116" w:right="244"/>
+              <w:jc w:val="right"/>
+              <w:rPr>
+                <w:rFonts w:ascii="仿宋" w:eastAsia="仿宋" w:hAnsi="仿宋" w:hint="eastAsia"/>
+                <w:color w:val="000000" w:themeColor="text1"/>
+              </w:rPr>
+            </w:pPr>
+            <w:r>
+              <w:rPr>
+                <w:rFonts w:ascii="仿宋" w:eastAsia="仿宋" w:hAnsi="仿宋" w:hint="eastAsia"/>
+                <w:color w:val="000000" w:themeColor="text1"/>
               </w:rPr>
             </w:r>
           </w:p>
@@ -1273,14 +1557,17 @@
           </w:tcPr>
           <w:p>
             <w:pPr>
-              <w:spacing w:after="0"/>
-            </w:pPr>
-            <w:r/>
-            <w:r>
-              <w:rPr>
-                <w:rFonts w:ascii="微软雅黑" w:hAnsi="微软雅黑" w:eastAsia="微软雅黑"/>
-                <w:b w:val="0"/>
-                <w:sz w:val="20"/>
+              <w:ind w:rightChars="116" w:right="244"/>
+              <w:jc w:val="right"/>
+              <w:rPr>
+                <w:rFonts w:ascii="仿宋" w:eastAsia="仿宋" w:hAnsi="仿宋" w:hint="eastAsia"/>
+                <w:color w:val="000000" w:themeColor="text1"/>
+              </w:rPr>
+            </w:pPr>
+            <w:r>
+              <w:rPr>
+                <w:rFonts w:ascii="仿宋" w:eastAsia="仿宋" w:hAnsi="仿宋" w:hint="eastAsia"/>
+                <w:color w:val="000000" w:themeColor="text1"/>
               </w:rPr>
             </w:r>
           </w:p>
@@ -1292,14 +1579,17 @@
           </w:tcPr>
           <w:p>
             <w:pPr>
-              <w:spacing w:after="0"/>
-            </w:pPr>
-            <w:r/>
-            <w:r>
-              <w:rPr>
-                <w:rFonts w:ascii="微软雅黑" w:hAnsi="微软雅黑" w:eastAsia="微软雅黑"/>
-                <w:b w:val="0"/>
-                <w:sz w:val="20"/>
+              <w:ind w:rightChars="116" w:right="244"/>
+              <w:jc w:val="right"/>
+              <w:rPr>
+                <w:rFonts w:ascii="仿宋" w:eastAsia="仿宋" w:hAnsi="仿宋" w:hint="eastAsia"/>
+                <w:color w:val="000000" w:themeColor="text1"/>
+              </w:rPr>
+            </w:pPr>
+            <w:r>
+              <w:rPr>
+                <w:rFonts w:ascii="仿宋" w:eastAsia="仿宋" w:hAnsi="仿宋" w:hint="eastAsia"/>
+                <w:color w:val="000000" w:themeColor="text1"/>
               </w:rPr>
             </w:r>
           </w:p>
@@ -1341,14 +1631,17 @@
           </w:tcPr>
           <w:p>
             <w:pPr>
-              <w:spacing w:after="0"/>
-            </w:pPr>
-            <w:r/>
-            <w:r>
-              <w:rPr>
-                <w:rFonts w:ascii="微软雅黑" w:hAnsi="微软雅黑" w:eastAsia="微软雅黑"/>
-                <w:b w:val="0"/>
-                <w:sz w:val="20"/>
+              <w:ind w:rightChars="116" w:right="244"/>
+              <w:jc w:val="right"/>
+              <w:rPr>
+                <w:rFonts w:ascii="仿宋" w:eastAsia="仿宋" w:hAnsi="仿宋" w:hint="eastAsia"/>
+                <w:color w:val="000000" w:themeColor="text1"/>
+              </w:rPr>
+            </w:pPr>
+            <w:r>
+              <w:rPr>
+                <w:rFonts w:ascii="仿宋" w:eastAsia="仿宋" w:hAnsi="仿宋" w:hint="eastAsia"/>
+                <w:color w:val="000000" w:themeColor="text1"/>
               </w:rPr>
               <w:t>90%</w:t>
             </w:r>
@@ -1362,14 +1655,17 @@
           </w:tcPr>
           <w:p>
             <w:pPr>
-              <w:spacing w:after="0"/>
-            </w:pPr>
-            <w:r/>
-            <w:r>
-              <w:rPr>
-                <w:rFonts w:ascii="微软雅黑" w:hAnsi="微软雅黑" w:eastAsia="微软雅黑"/>
-                <w:b w:val="0"/>
-                <w:sz w:val="20"/>
+              <w:ind w:rightChars="116" w:right="244"/>
+              <w:jc w:val="right"/>
+              <w:rPr>
+                <w:rFonts w:ascii="仿宋" w:eastAsia="仿宋" w:hAnsi="仿宋" w:hint="eastAsia"/>
+                <w:color w:val="000000" w:themeColor="text1"/>
+              </w:rPr>
+            </w:pPr>
+            <w:r>
+              <w:rPr>
+                <w:rFonts w:ascii="仿宋" w:eastAsia="仿宋" w:hAnsi="仿宋" w:hint="eastAsia"/>
+                <w:color w:val="000000" w:themeColor="text1"/>
               </w:rPr>
               <w:t>10%</w:t>
             </w:r>
@@ -1383,14 +1679,17 @@
           </w:tcPr>
           <w:p>
             <w:pPr>
-              <w:spacing w:after="0"/>
-            </w:pPr>
-            <w:r/>
-            <w:r>
-              <w:rPr>
-                <w:rFonts w:ascii="微软雅黑" w:hAnsi="微软雅黑" w:eastAsia="微软雅黑"/>
-                <w:b w:val="0"/>
-                <w:sz w:val="20"/>
+              <w:ind w:rightChars="116" w:right="244"/>
+              <w:jc w:val="right"/>
+              <w:rPr>
+                <w:rFonts w:ascii="仿宋" w:eastAsia="仿宋" w:hAnsi="仿宋" w:hint="eastAsia"/>
+                <w:color w:val="000000" w:themeColor="text1"/>
+              </w:rPr>
+            </w:pPr>
+            <w:r>
+              <w:rPr>
+                <w:rFonts w:ascii="仿宋" w:eastAsia="仿宋" w:hAnsi="仿宋" w:hint="eastAsia"/>
+                <w:color w:val="000000" w:themeColor="text1"/>
               </w:rPr>
             </w:r>
           </w:p>
@@ -1403,14 +1702,17 @@
           </w:tcPr>
           <w:p>
             <w:pPr>
-              <w:spacing w:after="0"/>
-            </w:pPr>
-            <w:r/>
-            <w:r>
-              <w:rPr>
-                <w:rFonts w:ascii="微软雅黑" w:hAnsi="微软雅黑" w:eastAsia="微软雅黑"/>
-                <w:b w:val="0"/>
-                <w:sz w:val="20"/>
+              <w:ind w:rightChars="116" w:right="244"/>
+              <w:jc w:val="right"/>
+              <w:rPr>
+                <w:rFonts w:ascii="仿宋" w:eastAsia="仿宋" w:hAnsi="仿宋" w:hint="eastAsia"/>
+                <w:color w:val="000000" w:themeColor="text1"/>
+              </w:rPr>
+            </w:pPr>
+            <w:r>
+              <w:rPr>
+                <w:rFonts w:ascii="仿宋" w:eastAsia="仿宋" w:hAnsi="仿宋" w:hint="eastAsia"/>
+                <w:color w:val="000000" w:themeColor="text1"/>
               </w:rPr>
             </w:r>
           </w:p>
@@ -1422,14 +1724,17 @@
           </w:tcPr>
           <w:p>
             <w:pPr>
-              <w:spacing w:after="0"/>
-            </w:pPr>
-            <w:r/>
-            <w:r>
-              <w:rPr>
-                <w:rFonts w:ascii="微软雅黑" w:hAnsi="微软雅黑" w:eastAsia="微软雅黑"/>
-                <w:b w:val="0"/>
-                <w:sz w:val="20"/>
+              <w:ind w:rightChars="116" w:right="244"/>
+              <w:jc w:val="right"/>
+              <w:rPr>
+                <w:rFonts w:ascii="仿宋" w:eastAsia="仿宋" w:hAnsi="仿宋" w:hint="eastAsia"/>
+                <w:color w:val="000000" w:themeColor="text1"/>
+              </w:rPr>
+            </w:pPr>
+            <w:r>
+              <w:rPr>
+                <w:rFonts w:ascii="仿宋" w:eastAsia="仿宋" w:hAnsi="仿宋" w:hint="eastAsia"/>
+                <w:color w:val="000000" w:themeColor="text1"/>
               </w:rPr>
             </w:r>
           </w:p>
@@ -1476,14 +1781,17 @@
           </w:tcPr>
           <w:p>
             <w:pPr>
-              <w:spacing w:after="0"/>
-            </w:pPr>
-            <w:r/>
-            <w:r>
-              <w:rPr>
-                <w:rFonts w:ascii="微软雅黑" w:hAnsi="微软雅黑" w:eastAsia="微软雅黑"/>
-                <w:b w:val="0"/>
-                <w:sz w:val="20"/>
+              <w:ind w:rightChars="116" w:right="244"/>
+              <w:jc w:val="right"/>
+              <w:rPr>
+                <w:rFonts w:ascii="仿宋" w:eastAsia="仿宋" w:hAnsi="仿宋" w:hint="eastAsia"/>
+                <w:color w:val="000000" w:themeColor="text1"/>
+              </w:rPr>
+            </w:pPr>
+            <w:r>
+              <w:rPr>
+                <w:rFonts w:ascii="仿宋" w:eastAsia="仿宋" w:hAnsi="仿宋" w:hint="eastAsia"/>
+                <w:color w:val="000000" w:themeColor="text1"/>
               </w:rPr>
               <w:t>90%</w:t>
             </w:r>
@@ -1500,14 +1808,17 @@
           </w:tcPr>
           <w:p>
             <w:pPr>
-              <w:spacing w:after="0"/>
-            </w:pPr>
-            <w:r/>
-            <w:r>
-              <w:rPr>
-                <w:rFonts w:ascii="微软雅黑" w:hAnsi="微软雅黑" w:eastAsia="微软雅黑"/>
-                <w:b w:val="0"/>
-                <w:sz w:val="20"/>
+              <w:ind w:rightChars="116" w:right="244"/>
+              <w:jc w:val="right"/>
+              <w:rPr>
+                <w:rFonts w:ascii="仿宋" w:eastAsia="仿宋" w:hAnsi="仿宋" w:hint="eastAsia"/>
+                <w:color w:val="000000" w:themeColor="text1"/>
+              </w:rPr>
+            </w:pPr>
+            <w:r>
+              <w:rPr>
+                <w:rFonts w:ascii="仿宋" w:eastAsia="仿宋" w:hAnsi="仿宋" w:hint="eastAsia"/>
+                <w:color w:val="000000" w:themeColor="text1"/>
               </w:rPr>
               <w:t>10%</w:t>
             </w:r>
@@ -1524,14 +1835,17 @@
           </w:tcPr>
           <w:p>
             <w:pPr>
-              <w:spacing w:after="0"/>
-            </w:pPr>
-            <w:r/>
-            <w:r>
-              <w:rPr>
-                <w:rFonts w:ascii="微软雅黑" w:hAnsi="微软雅黑" w:eastAsia="微软雅黑"/>
-                <w:b w:val="0"/>
-                <w:sz w:val="20"/>
+              <w:ind w:rightChars="116" w:right="244"/>
+              <w:jc w:val="right"/>
+              <w:rPr>
+                <w:rFonts w:ascii="仿宋" w:eastAsia="仿宋" w:hAnsi="仿宋" w:hint="eastAsia"/>
+                <w:color w:val="000000" w:themeColor="text1"/>
+              </w:rPr>
+            </w:pPr>
+            <w:r>
+              <w:rPr>
+                <w:rFonts w:ascii="仿宋" w:eastAsia="仿宋" w:hAnsi="仿宋" w:hint="eastAsia"/>
+                <w:color w:val="000000" w:themeColor="text1"/>
               </w:rPr>
             </w:r>
           </w:p>
@@ -1544,14 +1858,17 @@
           </w:tcPr>
           <w:p>
             <w:pPr>
-              <w:spacing w:after="0"/>
-            </w:pPr>
-            <w:r/>
-            <w:r>
-              <w:rPr>
-                <w:rFonts w:ascii="微软雅黑" w:hAnsi="微软雅黑" w:eastAsia="微软雅黑"/>
-                <w:b w:val="0"/>
-                <w:sz w:val="20"/>
+              <w:ind w:rightChars="116" w:right="244"/>
+              <w:jc w:val="right"/>
+              <w:rPr>
+                <w:rFonts w:ascii="仿宋" w:eastAsia="仿宋" w:hAnsi="仿宋" w:hint="eastAsia"/>
+                <w:color w:val="000000" w:themeColor="text1"/>
+              </w:rPr>
+            </w:pPr>
+            <w:r>
+              <w:rPr>
+                <w:rFonts w:ascii="仿宋" w:eastAsia="仿宋" w:hAnsi="仿宋" w:hint="eastAsia"/>
+                <w:color w:val="000000" w:themeColor="text1"/>
               </w:rPr>
             </w:r>
           </w:p>
@@ -1563,14 +1880,17 @@
           </w:tcPr>
           <w:p>
             <w:pPr>
-              <w:spacing w:after="0"/>
-            </w:pPr>
-            <w:r/>
-            <w:r>
-              <w:rPr>
-                <w:rFonts w:ascii="微软雅黑" w:hAnsi="微软雅黑" w:eastAsia="微软雅黑"/>
-                <w:b w:val="0"/>
-                <w:sz w:val="20"/>
+              <w:ind w:rightChars="116" w:right="244"/>
+              <w:jc w:val="right"/>
+              <w:rPr>
+                <w:rFonts w:ascii="仿宋" w:eastAsia="仿宋" w:hAnsi="仿宋" w:hint="eastAsia"/>
+                <w:color w:val="000000" w:themeColor="text1"/>
+              </w:rPr>
+            </w:pPr>
+            <w:r>
+              <w:rPr>
+                <w:rFonts w:ascii="仿宋" w:eastAsia="仿宋" w:hAnsi="仿宋" w:hint="eastAsia"/>
+                <w:color w:val="000000" w:themeColor="text1"/>
               </w:rPr>
             </w:r>
           </w:p>
@@ -1735,29 +2055,77 @@
           </w:tcPr>
           <w:p>
             <w:pPr>
-              <w:spacing w:after="0"/>
-            </w:pPr>
-            <w:r/>
-            <w:r>
-              <w:rPr>
-                <w:rFonts w:ascii="微软雅黑" w:hAnsi="微软雅黑" w:eastAsia="微软雅黑"/>
-                <w:b w:val="0"/>
-                <w:sz w:val="20"/>
-              </w:rPr>
-              <w:t>■理论指导  ■技术方案</w:t>
-            </w:r>
-          </w:p>
-          <w:p>
-            <w:pPr>
-              <w:spacing w:after="0"/>
-            </w:pPr>
-            <w:r>
-              <w:rPr>
-                <w:rFonts w:ascii="微软雅黑" w:hAnsi="微软雅黑" w:eastAsia="微软雅黑"/>
-                <w:b w:val="0"/>
-                <w:sz w:val="20"/>
-              </w:rPr>
-              <w:t>姓名：指导教师（待填写）</w:t>
+              <w:rPr>
+                <w:rFonts w:ascii="仿宋" w:eastAsia="仿宋" w:hAnsi="仿宋" w:hint="eastAsia"/>
+                <w:smallCaps/>
+                <w:color w:val="000000" w:themeColor="text1"/>
+              </w:rPr>
+            </w:pPr>
+            <w:r>
+              <w:rPr>
+                <w:rFonts w:ascii="仿宋" w:eastAsia="仿宋" w:hAnsi="仿宋" w:hint="eastAsia"/>
+                <w:smallCaps/>
+                <w:color w:val="000000" w:themeColor="text1"/>
+              </w:rPr>
+              <w:t>□作品创意 ■理论指导 ■技术方案 □实验场地 □硬件资源</w:t>
+            </w:r>
+          </w:p>
+          <w:p>
+            <w:pPr>
+              <w:rPr>
+                <w:rFonts w:ascii="仿宋" w:eastAsia="仿宋" w:hAnsi="仿宋" w:hint="eastAsia"/>
+                <w:smallCaps/>
+                <w:color w:val="000000" w:themeColor="text1"/>
+              </w:rPr>
+            </w:pPr>
+            <w:r>
+              <w:rPr>
+                <w:rFonts w:ascii="仿宋" w:eastAsia="仿宋" w:hAnsi="仿宋" w:hint="eastAsia"/>
+                <w:smallCaps/>
+                <w:color w:val="000000" w:themeColor="text1"/>
+              </w:rPr>
+              <w:t>□数据提供 □后勤支持 □宣讲通知 □组织协调 □经费支持</w:t>
+            </w:r>
+          </w:p>
+          <w:p>
+            <w:pPr>
+              <w:rPr>
+                <w:rFonts w:ascii="仿宋" w:eastAsia="仿宋" w:hAnsi="仿宋" w:hint="eastAsia"/>
+                <w:smallCaps/>
+                <w:color w:val="000000" w:themeColor="text1"/>
+              </w:rPr>
+            </w:pPr>
+            <w:r>
+              <w:rPr>
+                <w:rFonts w:ascii="仿宋" w:eastAsia="仿宋" w:hAnsi="仿宋" w:hint="eastAsia"/>
+                <w:smallCaps/>
+                <w:color w:val="000000" w:themeColor="text1"/>
+              </w:rPr>
+              <w:t>■其他：姓名待补（指导教师（待填写））</w:t>
+            </w:r>
+            <w:r>
+              <w:rPr>
+                <w:rFonts w:ascii="仿宋" w:eastAsia="仿宋" w:hAnsi="仿宋"/>
+                <w:smallCaps/>
+                <w:color w:val="000000" w:themeColor="text1"/>
+                <w:u w:val="single"/>
+              </w:rPr>
+            </w:r>
+            <w:r>
+              <w:rPr>
+                <w:rFonts w:ascii="仿宋" w:eastAsia="仿宋" w:hAnsi="仿宋" w:hint="eastAsia"/>
+                <w:smallCaps/>
+                <w:color w:val="000000" w:themeColor="text1"/>
+                <w:u w:val="single"/>
+              </w:rPr>
+            </w:r>
+            <w:r>
+              <w:rPr>
+                <w:rFonts w:ascii="仿宋" w:eastAsia="仿宋" w:hAnsi="仿宋"/>
+                <w:smallCaps/>
+                <w:color w:val="000000" w:themeColor="text1"/>
+                <w:u w:val="single"/>
+              </w:rPr>
             </w:r>
           </w:p>
         </w:tc>
@@ -1797,16 +2165,91 @@
           </w:tcPr>
           <w:p>
             <w:pPr>
-              <w:spacing w:after="0"/>
-            </w:pPr>
-            <w:r/>
-            <w:r>
-              <w:rPr>
-                <w:rFonts w:ascii="微软雅黑" w:hAnsi="微软雅黑" w:eastAsia="微软雅黑"/>
-                <w:b w:val="0"/>
-                <w:sz w:val="20"/>
-              </w:rPr>
-              <w:t>■Windows  ■Linux  ■macOS（开发整理以 macOS 为主）</w:t>
+              <w:rPr>
+                <w:rFonts w:ascii="仿宋" w:eastAsia="仿宋" w:hAnsi="仿宋" w:hint="eastAsia"/>
+                <w:color w:val="000000" w:themeColor="text1"/>
+              </w:rPr>
+            </w:pPr>
+            <w:r>
+              <w:rPr>
+                <w:rFonts w:ascii="仿宋" w:eastAsia="仿宋" w:hAnsi="仿宋" w:hint="eastAsia"/>
+                <w:smallCaps/>
+                <w:color w:val="000000" w:themeColor="text1"/>
+              </w:rPr>
+              <w:t>□Windows □Linux ■macOS □其他：</w:t>
+            </w:r>
+            <w:r>
+              <w:rPr>
+                <w:rFonts w:ascii="仿宋" w:eastAsia="仿宋" w:hAnsi="仿宋" w:cs="Times New Roman" w:hint="eastAsia"/>
+                <w:smallCaps/>
+                <w:color w:val="000000" w:themeColor="text1"/>
+              </w:rPr>
+            </w:r>
+            <w:r>
+              <w:rPr>
+                <w:rFonts w:ascii="仿宋" w:eastAsia="仿宋" w:hAnsi="仿宋" w:cs="Times New Roman"/>
+                <w:smallCaps/>
+                <w:color w:val="000000" w:themeColor="text1"/>
+              </w:rPr>
+            </w:r>
+            <w:r>
+              <w:rPr>
+                <w:rFonts w:ascii="仿宋" w:eastAsia="仿宋" w:hAnsi="仿宋" w:hint="eastAsia"/>
+                <w:smallCaps/>
+                <w:color w:val="000000" w:themeColor="text1"/>
+              </w:rPr>
+            </w:r>
+            <w:r>
+              <w:rPr>
+                <w:rFonts w:ascii="仿宋" w:eastAsia="仿宋" w:hAnsi="仿宋"/>
+                <w:smallCaps/>
+                <w:color w:val="000000" w:themeColor="text1"/>
+              </w:rPr>
+            </w:r>
+            <w:r>
+              <w:rPr>
+                <w:rFonts w:ascii="仿宋" w:eastAsia="仿宋" w:hAnsi="仿宋" w:hint="eastAsia"/>
+                <w:smallCaps/>
+                <w:color w:val="000000" w:themeColor="text1"/>
+              </w:rPr>
+            </w:r>
+            <w:r>
+              <w:rPr>
+                <w:rFonts w:ascii="仿宋" w:eastAsia="仿宋" w:hAnsi="仿宋"/>
+                <w:smallCaps/>
+                <w:color w:val="000000" w:themeColor="text1"/>
+              </w:rPr>
+            </w:r>
+            <w:r>
+              <w:rPr>
+                <w:rFonts w:ascii="仿宋" w:eastAsia="仿宋" w:hAnsi="仿宋" w:hint="eastAsia"/>
+                <w:smallCaps/>
+                <w:color w:val="000000" w:themeColor="text1"/>
+              </w:rPr>
+            </w:r>
+            <w:r>
+              <w:rPr>
+                <w:rFonts w:ascii="仿宋" w:eastAsia="仿宋" w:hAnsi="仿宋"/>
+                <w:smallCaps/>
+                <w:color w:val="000000" w:themeColor="text1"/>
+                <w:u w:val="single"/>
+              </w:rPr>
+            </w:r>
+            <w:r>
+              <w:rPr>
+                <w:rFonts w:ascii="仿宋" w:eastAsia="仿宋" w:hAnsi="仿宋" w:hint="eastAsia"/>
+                <w:smallCaps/>
+                <w:color w:val="000000" w:themeColor="text1"/>
+                <w:u w:val="single"/>
+              </w:rPr>
+            </w:r>
+            <w:r>
+              <w:rPr>
+                <w:rFonts w:ascii="仿宋" w:eastAsia="仿宋" w:hAnsi="仿宋"/>
+                <w:smallCaps/>
+                <w:color w:val="000000" w:themeColor="text1"/>
+                <w:u w:val="single"/>
+              </w:rPr>
             </w:r>
           </w:p>
         </w:tc>
@@ -1846,16 +2289,119 @@
           </w:tcPr>
           <w:p>
             <w:pPr>
-              <w:spacing w:after="0"/>
-            </w:pPr>
-            <w:r/>
-            <w:r>
-              <w:rPr>
-                <w:rFonts w:ascii="微软雅黑" w:hAnsi="微软雅黑" w:eastAsia="微软雅黑"/>
-                <w:b w:val="0"/>
-                <w:sz w:val="20"/>
-              </w:rPr>
-              <w:t>■Windows  ■Linux  ■macOS  ■iOS  ■Android（Web + 微信小程序）</w:t>
+              <w:rPr>
+                <w:rFonts w:ascii="仿宋" w:eastAsia="仿宋" w:hAnsi="仿宋" w:hint="eastAsia"/>
+                <w:color w:val="000000" w:themeColor="text1"/>
+              </w:rPr>
+            </w:pPr>
+            <w:r>
+              <w:rPr>
+                <w:rFonts w:ascii="仿宋" w:eastAsia="仿宋" w:hAnsi="仿宋" w:hint="eastAsia"/>
+                <w:smallCaps/>
+                <w:color w:val="000000" w:themeColor="text1"/>
+              </w:rPr>
+              <w:t>□Windows □Linux ■macOS □iOS □Android □其他：</w:t>
+            </w:r>
+            <w:r>
+              <w:rPr>
+                <w:rFonts w:ascii="仿宋" w:eastAsia="仿宋" w:hAnsi="仿宋" w:cs="Times New Roman" w:hint="eastAsia"/>
+                <w:smallCaps/>
+                <w:color w:val="000000" w:themeColor="text1"/>
+              </w:rPr>
+            </w:r>
+            <w:r>
+              <w:rPr>
+                <w:rFonts w:ascii="仿宋" w:eastAsia="仿宋" w:hAnsi="仿宋" w:cs="Times New Roman"/>
+                <w:smallCaps/>
+                <w:color w:val="000000" w:themeColor="text1"/>
+              </w:rPr>
+            </w:r>
+            <w:r>
+              <w:rPr>
+                <w:rFonts w:ascii="仿宋" w:eastAsia="仿宋" w:hAnsi="仿宋" w:hint="eastAsia"/>
+                <w:smallCaps/>
+                <w:color w:val="000000" w:themeColor="text1"/>
+              </w:rPr>
+            </w:r>
+            <w:r>
+              <w:rPr>
+                <w:rFonts w:ascii="仿宋" w:eastAsia="仿宋" w:hAnsi="仿宋"/>
+                <w:smallCaps/>
+                <w:color w:val="000000" w:themeColor="text1"/>
+              </w:rPr>
+            </w:r>
+            <w:r>
+              <w:rPr>
+                <w:rFonts w:ascii="仿宋" w:eastAsia="仿宋" w:hAnsi="仿宋" w:hint="eastAsia"/>
+                <w:smallCaps/>
+                <w:color w:val="000000" w:themeColor="text1"/>
+              </w:rPr>
+            </w:r>
+            <w:r>
+              <w:rPr>
+                <w:rFonts w:ascii="仿宋" w:eastAsia="仿宋" w:hAnsi="仿宋"/>
+                <w:smallCaps/>
+                <w:color w:val="000000" w:themeColor="text1"/>
+              </w:rPr>
+            </w:r>
+            <w:r>
+              <w:rPr>
+                <w:rFonts w:ascii="仿宋" w:eastAsia="仿宋" w:hAnsi="仿宋" w:hint="eastAsia"/>
+                <w:smallCaps/>
+                <w:color w:val="000000" w:themeColor="text1"/>
+              </w:rPr>
+            </w:r>
+            <w:r>
+              <w:rPr>
+                <w:rFonts w:ascii="仿宋" w:eastAsia="仿宋" w:hAnsi="仿宋"/>
+                <w:smallCaps/>
+                <w:color w:val="000000" w:themeColor="text1"/>
+              </w:rPr>
+            </w:r>
+            <w:r>
+              <w:rPr>
+                <w:rFonts w:ascii="仿宋" w:eastAsia="仿宋" w:hAnsi="仿宋" w:hint="eastAsia"/>
+                <w:smallCaps/>
+                <w:color w:val="000000" w:themeColor="text1"/>
+              </w:rPr>
+            </w:r>
+            <w:r>
+              <w:rPr>
+                <w:rFonts w:ascii="仿宋" w:eastAsia="仿宋" w:hAnsi="仿宋"/>
+                <w:smallCaps/>
+                <w:color w:val="000000" w:themeColor="text1"/>
+              </w:rPr>
+            </w:r>
+            <w:r>
+              <w:rPr>
+                <w:rFonts w:ascii="仿宋" w:eastAsia="仿宋" w:hAnsi="仿宋" w:hint="eastAsia"/>
+                <w:smallCaps/>
+                <w:color w:val="000000" w:themeColor="text1"/>
+              </w:rPr>
+            </w:r>
+            <w:r>
+              <w:rPr>
+                <w:rFonts w:ascii="仿宋" w:eastAsia="仿宋" w:hAnsi="仿宋"/>
+                <w:smallCaps/>
+                <w:color w:val="000000" w:themeColor="text1"/>
+                <w:u w:val="single"/>
+              </w:rPr>
+            </w:r>
+            <w:r>
+              <w:rPr>
+                <w:rFonts w:ascii="仿宋" w:eastAsia="仿宋" w:hAnsi="仿宋" w:hint="eastAsia"/>
+                <w:smallCaps/>
+                <w:color w:val="000000" w:themeColor="text1"/>
+                <w:u w:val="single"/>
+              </w:rPr>
+            </w:r>
+            <w:r>
+              <w:rPr>
+                <w:rFonts w:ascii="仿宋" w:eastAsia="仿宋" w:hAnsi="仿宋"/>
+                <w:smallCaps/>
+                <w:color w:val="000000" w:themeColor="text1"/>
+                <w:u w:val="single"/>
+              </w:rPr>
             </w:r>
           </w:p>
         </w:tc>
@@ -1895,16 +2441,17 @@
           </w:tcPr>
           <w:p>
             <w:pPr>
-              <w:spacing w:after="0"/>
-            </w:pPr>
-            <w:r/>
-            <w:r>
-              <w:rPr>
-                <w:rFonts w:ascii="微软雅黑" w:hAnsi="微软雅黑" w:eastAsia="微软雅黑"/>
-                <w:b w:val="0"/>
-                <w:sz w:val="20"/>
-              </w:rPr>
-              <w:t>Python 3、Flask 3、SQLAlchemy 2、PostgreSQL 16、Redis 7、Docker、Jinja2、原生 JS/CSS、微信开发者工具、Chrome DevTools、Git</w:t>
+              <w:rPr>
+                <w:rFonts w:ascii="仿宋" w:eastAsia="仿宋" w:hAnsi="仿宋" w:hint="eastAsia"/>
+                <w:smallCaps/>
+                <w:color w:val="000000" w:themeColor="text1"/>
+              </w:rPr>
+            </w:pPr>
+            <w:r>
+              <w:rPr>
+                <w:rFonts w:ascii="仿宋" w:hAnsi="仿宋" w:eastAsia="仿宋"/>
+              </w:rPr>
+              <w:t>Python 3、Flask 3、SQLAlchemy 2、PostgreSQL 16、Redis 7、Docker、Jinja2、原生JS/CSS、微信开发者工具、Chrome DevTools、Git</w:t>
             </w:r>
           </w:p>
         </w:tc>
@@ -1957,42 +2504,196 @@
           </w:tcPr>
           <w:p>
             <w:pPr>
-              <w:spacing w:after="0"/>
-            </w:pPr>
-            <w:r/>
-            <w:r>
-              <w:rPr>
-                <w:rFonts w:ascii="微软雅黑" w:hAnsi="微软雅黑" w:eastAsia="微软雅黑"/>
-                <w:b w:val="0"/>
-                <w:sz w:val="20"/>
-              </w:rPr>
-              <w:t>1. Flask 官方文档</w:t>
-            </w:r>
-          </w:p>
-          <w:p>
-            <w:pPr>
-              <w:spacing w:after="0"/>
-            </w:pPr>
-            <w:r>
-              <w:rPr>
-                <w:rFonts w:ascii="微软雅黑" w:hAnsi="微软雅黑" w:eastAsia="微软雅黑"/>
-                <w:b w:val="0"/>
-                <w:sz w:val="20"/>
-              </w:rPr>
-              <w:t>2. SQLAlchemy 官方文档</w:t>
-            </w:r>
-          </w:p>
-          <w:p>
-            <w:pPr>
-              <w:spacing w:after="0"/>
-            </w:pPr>
-            <w:r>
-              <w:rPr>
-                <w:rFonts w:ascii="微软雅黑" w:hAnsi="微软雅黑" w:eastAsia="微软雅黑"/>
-                <w:b w:val="0"/>
-                <w:sz w:val="20"/>
-              </w:rPr>
-              <w:t>3. Docker 官方文档</w:t>
+              <w:rPr>
+                <w:rFonts w:ascii="仿宋" w:eastAsia="仿宋" w:hAnsi="仿宋" w:hint="eastAsia"/>
+                <w:smallCaps/>
+                <w:color w:val="000000" w:themeColor="text1"/>
+                <w:u w:val="single"/>
+              </w:rPr>
+            </w:pPr>
+            <w:r>
+              <w:rPr>
+                <w:rFonts w:ascii="仿宋" w:eastAsia="仿宋" w:hAnsi="仿宋" w:hint="eastAsia"/>
+                <w:color w:val="000000" w:themeColor="text1"/>
+              </w:rPr>
+              <w:t>1、Flask 官方文档</w:t>
+            </w:r>
+            <w:r>
+              <w:rPr>
+                <w:rFonts w:ascii="仿宋" w:eastAsia="仿宋" w:hAnsi="仿宋" w:hint="eastAsia"/>
+                <w:smallCaps/>
+                <w:color w:val="000000" w:themeColor="text1"/>
+                <w:u w:val="single"/>
+              </w:rPr>
+            </w:r>
+            <w:r>
+              <w:rPr>
+                <w:rFonts w:ascii="仿宋" w:eastAsia="仿宋" w:hAnsi="仿宋"/>
+                <w:smallCaps/>
+                <w:color w:val="000000" w:themeColor="text1"/>
+                <w:u w:val="single"/>
+              </w:rPr>
+            </w:r>
+            <w:r>
+              <w:rPr>
+                <w:rFonts w:ascii="仿宋" w:eastAsia="仿宋" w:hAnsi="仿宋" w:hint="eastAsia"/>
+                <w:smallCaps/>
+                <w:color w:val="000000" w:themeColor="text1"/>
+                <w:u w:val="single"/>
+              </w:rPr>
+            </w:r>
+            <w:r>
+              <w:rPr>
+                <w:rFonts w:ascii="仿宋" w:eastAsia="仿宋" w:hAnsi="仿宋"/>
+                <w:smallCaps/>
+                <w:color w:val="000000" w:themeColor="text1"/>
+                <w:u w:val="single"/>
+              </w:rPr>
+            </w:r>
+            <w:r>
+              <w:rPr>
+                <w:rFonts w:ascii="仿宋" w:eastAsia="仿宋" w:hAnsi="仿宋" w:hint="eastAsia"/>
+                <w:smallCaps/>
+                <w:color w:val="000000" w:themeColor="text1"/>
+                <w:u w:val="single"/>
+              </w:rPr>
+            </w:r>
+            <w:r>
+              <w:rPr>
+                <w:rFonts w:ascii="仿宋" w:eastAsia="仿宋" w:hAnsi="仿宋"/>
+                <w:smallCaps/>
+                <w:color w:val="000000" w:themeColor="text1"/>
+                <w:u w:val="single"/>
+              </w:rPr>
+            </w:r>
+          </w:p>
+          <w:p>
+            <w:pPr>
+              <w:rPr>
+                <w:rFonts w:ascii="仿宋" w:eastAsia="仿宋" w:hAnsi="仿宋" w:hint="eastAsia"/>
+                <w:smallCaps/>
+                <w:color w:val="000000" w:themeColor="text1"/>
+                <w:u w:val="single"/>
+              </w:rPr>
+            </w:pPr>
+            <w:r>
+              <w:rPr>
+                <w:rFonts w:ascii="仿宋" w:eastAsia="仿宋" w:hAnsi="仿宋" w:hint="eastAsia"/>
+                <w:color w:val="000000" w:themeColor="text1"/>
+              </w:rPr>
+              <w:t>2、SQLAlchemy 官方文档</w:t>
+            </w:r>
+            <w:r>
+              <w:rPr>
+                <w:rFonts w:ascii="仿宋" w:eastAsia="仿宋" w:hAnsi="仿宋" w:hint="eastAsia"/>
+                <w:smallCaps/>
+                <w:color w:val="000000" w:themeColor="text1"/>
+                <w:u w:val="single"/>
+              </w:rPr>
+            </w:r>
+            <w:r>
+              <w:rPr>
+                <w:rFonts w:ascii="仿宋" w:eastAsia="仿宋" w:hAnsi="仿宋"/>
+                <w:smallCaps/>
+                <w:color w:val="000000" w:themeColor="text1"/>
+                <w:u w:val="single"/>
+              </w:rPr>
+            </w:r>
+            <w:r>
+              <w:rPr>
+                <w:rFonts w:ascii="仿宋" w:eastAsia="仿宋" w:hAnsi="仿宋" w:hint="eastAsia"/>
+                <w:smallCaps/>
+                <w:color w:val="000000" w:themeColor="text1"/>
+                <w:u w:val="single"/>
+              </w:rPr>
+            </w:r>
+            <w:r>
+              <w:rPr>
+                <w:rFonts w:ascii="仿宋" w:eastAsia="仿宋" w:hAnsi="仿宋"/>
+                <w:smallCaps/>
+                <w:color w:val="000000" w:themeColor="text1"/>
+                <w:u w:val="single"/>
+              </w:rPr>
+            </w:r>
+            <w:r>
+              <w:rPr>
+                <w:rFonts w:ascii="仿宋" w:eastAsia="仿宋" w:hAnsi="仿宋" w:hint="eastAsia"/>
+                <w:smallCaps/>
+                <w:color w:val="000000" w:themeColor="text1"/>
+                <w:u w:val="single"/>
+              </w:rPr>
+            </w:r>
+            <w:r>
+              <w:rPr>
+                <w:rFonts w:ascii="仿宋" w:eastAsia="仿宋" w:hAnsi="仿宋"/>
+                <w:smallCaps/>
+                <w:color w:val="000000" w:themeColor="text1"/>
+                <w:u w:val="single"/>
+              </w:rPr>
+            </w:r>
+          </w:p>
+          <w:p>
+            <w:pPr>
+              <w:rPr>
+                <w:rFonts w:ascii="仿宋" w:eastAsia="仿宋" w:hAnsi="仿宋" w:hint="eastAsia"/>
+                <w:smallCaps/>
+                <w:color w:val="000000" w:themeColor="text1"/>
+              </w:rPr>
+            </w:pPr>
+            <w:r>
+              <w:rPr>
+                <w:rFonts w:ascii="仿宋" w:eastAsia="仿宋" w:hAnsi="仿宋" w:hint="eastAsia"/>
+                <w:color w:val="000000" w:themeColor="text1"/>
+              </w:rPr>
+              <w:t>3、Docker 官方文档</w:t>
+            </w:r>
+            <w:r>
+              <w:rPr>
+                <w:rFonts w:ascii="仿宋" w:eastAsia="仿宋" w:hAnsi="仿宋" w:hint="eastAsia"/>
+                <w:smallCaps/>
+                <w:color w:val="000000" w:themeColor="text1"/>
+                <w:u w:val="single"/>
+              </w:rPr>
+            </w:r>
+            <w:r>
+              <w:rPr>
+                <w:rFonts w:ascii="仿宋" w:eastAsia="仿宋" w:hAnsi="仿宋"/>
+                <w:smallCaps/>
+                <w:color w:val="000000" w:themeColor="text1"/>
+                <w:u w:val="single"/>
+              </w:rPr>
+            </w:r>
+            <w:r>
+              <w:rPr>
+                <w:rFonts w:ascii="仿宋" w:eastAsia="仿宋" w:hAnsi="仿宋" w:hint="eastAsia"/>
+                <w:smallCaps/>
+                <w:color w:val="000000" w:themeColor="text1"/>
+                <w:u w:val="single"/>
+              </w:rPr>
+            </w:r>
+            <w:r>
+              <w:rPr>
+                <w:rFonts w:ascii="仿宋" w:eastAsia="仿宋" w:hAnsi="仿宋"/>
+                <w:smallCaps/>
+                <w:color w:val="000000" w:themeColor="text1"/>
+                <w:u w:val="single"/>
+              </w:rPr>
+            </w:r>
+            <w:r>
+              <w:rPr>
+                <w:rFonts w:ascii="仿宋" w:eastAsia="仿宋" w:hAnsi="仿宋" w:hint="eastAsia"/>
+                <w:smallCaps/>
+                <w:color w:val="000000" w:themeColor="text1"/>
+                <w:u w:val="single"/>
+              </w:rPr>
+            </w:r>
+            <w:r>
+              <w:rPr>
+                <w:rFonts w:ascii="仿宋" w:eastAsia="仿宋" w:hAnsi="仿宋"/>
+                <w:smallCaps/>
+                <w:color w:val="000000" w:themeColor="text1"/>
+                <w:u w:val="single"/>
+              </w:rPr>
             </w:r>
           </w:p>
         </w:tc>
@@ -2044,16 +2745,152 @@
           </w:tcPr>
           <w:p>
             <w:pPr>
-              <w:spacing w:after="0"/>
-            </w:pPr>
-            <w:r/>
-            <w:r>
-              <w:rPr>
-                <w:rFonts w:ascii="微软雅黑" w:hAnsi="微软雅黑" w:eastAsia="微软雅黑"/>
-                <w:b w:val="0"/>
-                <w:sz w:val="20"/>
-              </w:rPr>
-              <w:t>■素材压缩包  ■报告文档  ■演示视频  ■PPT  ■源代码  ■部署文件  □数据集  □模型  ■作品文件</w:t>
+              <w:rPr>
+                <w:rFonts w:ascii="仿宋" w:eastAsia="仿宋" w:hAnsi="仿宋" w:hint="eastAsia"/>
+                <w:smallCaps/>
+                <w:color w:val="000000" w:themeColor="text1"/>
+              </w:rPr>
+            </w:pPr>
+            <w:r>
+              <w:rPr>
+                <w:rFonts w:ascii="仿宋" w:eastAsia="仿宋" w:hAnsi="仿宋"/>
+                <w:smallCaps/>
+                <w:color w:val="000000" w:themeColor="text1"/>
+              </w:rPr>
+              <w:t>■素材压缩包 ■报告文档 ■演示视频 ■PPT ■源代码 ■部署文件</w:t>
+            </w:r>
+            <w:r>
+              <w:rPr>
+                <w:rFonts w:ascii="仿宋" w:eastAsia="仿宋" w:hAnsi="仿宋" w:hint="eastAsia"/>
+                <w:smallCaps/>
+                <w:color w:val="000000" w:themeColor="text1"/>
+              </w:rPr>
+            </w:r>
+            <w:r>
+              <w:rPr>
+                <w:rFonts w:ascii="仿宋" w:eastAsia="仿宋" w:hAnsi="仿宋"/>
+                <w:smallCaps/>
+                <w:color w:val="000000" w:themeColor="text1"/>
+              </w:rPr>
+            </w:r>
+            <w:r>
+              <w:rPr>
+                <w:rFonts w:ascii="仿宋" w:eastAsia="仿宋" w:hAnsi="仿宋" w:hint="eastAsia"/>
+                <w:smallCaps/>
+                <w:color w:val="000000" w:themeColor="text1"/>
+              </w:rPr>
+            </w:r>
+            <w:r>
+              <w:rPr>
+                <w:rFonts w:ascii="仿宋" w:eastAsia="仿宋" w:hAnsi="仿宋"/>
+                <w:smallCaps/>
+                <w:color w:val="000000" w:themeColor="text1"/>
+              </w:rPr>
+            </w:r>
+          </w:p>
+          <w:p>
+            <w:pPr>
+              <w:rPr>
+                <w:rFonts w:ascii="仿宋" w:eastAsia="仿宋" w:hAnsi="仿宋" w:hint="eastAsia"/>
+                <w:smallCaps/>
+                <w:color w:val="000000" w:themeColor="text1"/>
+              </w:rPr>
+            </w:pPr>
+            <w:r>
+              <w:rPr>
+                <w:rFonts w:ascii="仿宋" w:eastAsia="仿宋" w:hAnsi="仿宋" w:hint="eastAsia"/>
+                <w:smallCaps/>
+                <w:color w:val="000000" w:themeColor="text1"/>
+              </w:rPr>
+              <w:t>□数据集 □模型 ■作品文件 □其他</w:t>
+            </w:r>
+            <w:r>
+              <w:rPr>
+                <w:rFonts w:ascii="仿宋" w:eastAsia="仿宋" w:hAnsi="仿宋"/>
+                <w:smallCaps/>
+                <w:color w:val="000000" w:themeColor="text1"/>
+              </w:rPr>
+            </w:r>
+            <w:r>
+              <w:rPr>
+                <w:rFonts w:ascii="仿宋" w:eastAsia="仿宋" w:hAnsi="仿宋" w:hint="eastAsia"/>
+                <w:smallCaps/>
+                <w:color w:val="000000" w:themeColor="text1"/>
+              </w:rPr>
+            </w:r>
+            <w:r>
+              <w:rPr>
+                <w:rFonts w:ascii="仿宋" w:eastAsia="仿宋" w:hAnsi="仿宋"/>
+                <w:smallCaps/>
+                <w:color w:val="000000" w:themeColor="text1"/>
+              </w:rPr>
+            </w:r>
+            <w:r>
+              <w:rPr>
+                <w:rFonts w:ascii="仿宋" w:eastAsia="仿宋" w:hAnsi="仿宋" w:hint="eastAsia"/>
+                <w:smallCaps/>
+                <w:color w:val="000000" w:themeColor="text1"/>
+              </w:rPr>
+            </w:r>
+            <w:r>
+              <w:rPr>
+                <w:rFonts w:ascii="仿宋" w:eastAsia="仿宋" w:hAnsi="仿宋"/>
+                <w:smallCaps/>
+                <w:color w:val="000000" w:themeColor="text1"/>
+              </w:rPr>
+            </w:r>
+            <w:r>
+              <w:rPr>
+                <w:rFonts w:ascii="仿宋" w:eastAsia="仿宋" w:hAnsi="仿宋" w:hint="eastAsia"/>
+                <w:smallCaps/>
+                <w:color w:val="000000" w:themeColor="text1"/>
+              </w:rPr>
+            </w:r>
+            <w:r>
+              <w:rPr>
+                <w:rFonts w:ascii="仿宋" w:eastAsia="仿宋" w:hAnsi="仿宋"/>
+                <w:smallCaps/>
+                <w:color w:val="000000" w:themeColor="text1"/>
+              </w:rPr>
+            </w:r>
+            <w:r>
+              <w:rPr>
+                <w:rFonts w:ascii="仿宋" w:eastAsia="仿宋" w:hAnsi="仿宋" w:hint="eastAsia"/>
+                <w:smallCaps/>
+                <w:color w:val="000000" w:themeColor="text1"/>
+                <w:u w:val="single"/>
+              </w:rPr>
+            </w:r>
+            <w:r>
+              <w:rPr>
+                <w:rFonts w:ascii="仿宋" w:eastAsia="仿宋" w:hAnsi="仿宋"/>
+                <w:smallCaps/>
+                <w:color w:val="000000" w:themeColor="text1"/>
+                <w:u w:val="single"/>
+              </w:rPr>
+            </w:r>
+            <w:r>
+              <w:rPr>
+                <w:rFonts w:ascii="仿宋" w:eastAsia="仿宋" w:hAnsi="仿宋" w:hint="eastAsia"/>
+                <w:smallCaps/>
+                <w:color w:val="000000" w:themeColor="text1"/>
+                <w:u w:val="single"/>
+              </w:rPr>
+            </w:r>
+            <w:r>
+              <w:rPr>
+                <w:rFonts w:ascii="仿宋" w:eastAsia="仿宋" w:hAnsi="仿宋"/>
+                <w:smallCaps/>
+                <w:color w:val="000000" w:themeColor="text1"/>
+                <w:u w:val="single"/>
+              </w:rPr>
+            </w:r>
+            <w:r>
+              <w:rPr>
+                <w:rFonts w:ascii="仿宋" w:eastAsia="仿宋" w:hAnsi="仿宋" w:hint="eastAsia"/>
+                <w:smallCaps/>
+                <w:color w:val="000000" w:themeColor="text1"/>
+              </w:rPr>
             </w:r>
           </w:p>
         </w:tc>
@@ -2346,27 +3183,30 @@
           </w:tcPr>
           <w:p>
             <w:pPr>
-              <w:spacing w:after="0"/>
-            </w:pPr>
-            <w:r/>
-            <w:r>
-              <w:rPr>
-                <w:rFonts w:ascii="微软雅黑" w:hAnsi="微软雅黑" w:eastAsia="微软雅黑"/>
-                <w:b w:val="0"/>
-                <w:sz w:val="18"/>
+              <w:rPr>
+                <w:rFonts w:ascii="仿宋" w:eastAsia="仿宋" w:hAnsi="仿宋" w:hint="eastAsia"/>
+                <w:color w:val="000000" w:themeColor="text1"/>
+              </w:rPr>
+            </w:pPr>
+            <w:r>
+              <w:rPr>
+                <w:rFonts w:ascii="仿宋" w:eastAsia="仿宋" w:hAnsi="仿宋" w:hint="eastAsia"/>
+                <w:color w:val="000000" w:themeColor="text1"/>
               </w:rPr>
               <w:t>文件名：1 文档/运行网址与答辩说明</w:t>
             </w:r>
           </w:p>
           <w:p>
             <w:pPr>
-              <w:spacing w:after="0"/>
-            </w:pPr>
-            <w:r>
-              <w:rPr>
-                <w:rFonts w:ascii="微软雅黑" w:hAnsi="微软雅黑" w:eastAsia="微软雅黑"/>
-                <w:b w:val="0"/>
-                <w:sz w:val="18"/>
+              <w:rPr>
+                <w:rFonts w:ascii="仿宋" w:eastAsia="仿宋" w:hAnsi="仿宋" w:hint="eastAsia"/>
+                <w:color w:val="000000" w:themeColor="text1"/>
+              </w:rPr>
+            </w:pPr>
+            <w:r>
+              <w:rPr>
+                <w:rFonts w:ascii="仿宋" w:eastAsia="仿宋" w:hAnsi="仿宋" w:hint="eastAsia"/>
+                <w:color w:val="000000" w:themeColor="text1"/>
               </w:rPr>
               <w:t>描述：运行网址、亮点总结、答辩顺序与截图说明，含本地部署地址与正式演示地址。</w:t>
             </w:r>
@@ -2380,16 +3220,74 @@
           </w:tcPr>
           <w:p>
             <w:pPr>
-              <w:spacing w:after="0"/>
-            </w:pPr>
-            <w:r/>
-            <w:r>
-              <w:rPr>
-                <w:rFonts w:ascii="微软雅黑" w:hAnsi="微软雅黑" w:eastAsia="微软雅黑"/>
-                <w:b w:val="0"/>
-                <w:sz w:val="18"/>
+              <w:rPr>
+                <w:rFonts w:ascii="仿宋" w:eastAsia="仿宋" w:hAnsi="仿宋" w:hint="eastAsia"/>
+                <w:color w:val="000000" w:themeColor="text1"/>
+              </w:rPr>
+            </w:pPr>
+            <w:r>
+              <w:rPr>
+                <w:rFonts w:ascii="仿宋" w:eastAsia="仿宋" w:hAnsi="仿宋" w:hint="eastAsia"/>
+                <w:color w:val="000000" w:themeColor="text1"/>
               </w:rPr>
               <w:t>■已上传到网盘</w:t>
+            </w:r>
+          </w:p>
+          <w:p>
+            <w:pPr>
+              <w:rPr>
+                <w:rFonts w:ascii="仿宋" w:eastAsia="仿宋" w:hAnsi="仿宋" w:hint="eastAsia"/>
+                <w:color w:val="000000" w:themeColor="text1"/>
+              </w:rPr>
+            </w:pPr>
+            <w:r>
+              <w:rPr>
+                <w:rFonts w:ascii="仿宋" w:eastAsia="仿宋" w:hAnsi="仿宋" w:hint="eastAsia"/>
+                <w:color w:val="000000" w:themeColor="text1"/>
+              </w:rPr>
+              <w:t>□未上传，下载地址：</w:t>
+            </w:r>
+          </w:p>
+          <w:p>
+            <w:pPr>
+              <w:rPr>
+                <w:rFonts w:ascii="仿宋" w:eastAsia="仿宋" w:hAnsi="仿宋" w:hint="eastAsia"/>
+                <w:color w:val="000000" w:themeColor="text1"/>
+                <w:u w:val="single"/>
+              </w:rPr>
+            </w:pPr>
+            <w:r>
+              <w:rPr>
+                <w:rFonts w:ascii="仿宋" w:eastAsia="仿宋" w:hAnsi="仿宋"/>
+                <w:color w:val="000000" w:themeColor="text1"/>
+                <w:u w:val="single"/>
+              </w:rPr>
+              <w:tab/>
+            </w:r>
+            <w:r>
+              <w:rPr>
+                <w:rFonts w:ascii="仿宋" w:eastAsia="仿宋" w:hAnsi="仿宋"/>
+                <w:color w:val="000000" w:themeColor="text1"/>
+                <w:u w:val="single"/>
+              </w:rPr>
+              <w:tab/>
+            </w:r>
+            <w:r>
+              <w:rPr>
+                <w:rFonts w:ascii="仿宋" w:eastAsia="仿宋" w:hAnsi="仿宋"/>
+                <w:color w:val="000000" w:themeColor="text1"/>
+                <w:u w:val="single"/>
+              </w:rPr>
+              <w:tab/>
+            </w:r>
+            <w:r>
+              <w:rPr>
+                <w:rFonts w:ascii="仿宋" w:eastAsia="仿宋" w:hAnsi="仿宋"/>
+                <w:color w:val="000000" w:themeColor="text1"/>
+                <w:u w:val="single"/>
+              </w:rPr>
+              <w:tab/>
+              <w:t xml:space="preserve">      </w:t>
             </w:r>
           </w:p>
         </w:tc>
@@ -2401,16 +3299,57 @@
           </w:tcPr>
           <w:p>
             <w:pPr>
-              <w:spacing w:after="0"/>
-            </w:pPr>
-            <w:r/>
-            <w:r>
-              <w:rPr>
-                <w:rFonts w:ascii="微软雅黑" w:hAnsi="微软雅黑" w:eastAsia="微软雅黑"/>
-                <w:b w:val="0"/>
-                <w:sz w:val="18"/>
-              </w:rPr>
-              <w:t>■自制</w:t>
+              <w:rPr>
+                <w:rFonts w:ascii="仿宋" w:eastAsia="仿宋" w:hAnsi="仿宋" w:hint="eastAsia"/>
+                <w:color w:val="000000" w:themeColor="text1"/>
+              </w:rPr>
+            </w:pPr>
+            <w:r>
+              <w:rPr>
+                <w:rFonts w:ascii="仿宋" w:eastAsia="仿宋" w:hAnsi="仿宋" w:hint="eastAsia"/>
+                <w:color w:val="000000" w:themeColor="text1"/>
+              </w:rPr>
+              <w:t>■自制  □未知版权</w:t>
+            </w:r>
+          </w:p>
+          <w:p>
+            <w:pPr>
+              <w:rPr>
+                <w:rFonts w:ascii="仿宋" w:eastAsia="仿宋" w:hAnsi="仿宋" w:hint="eastAsia"/>
+                <w:color w:val="000000" w:themeColor="text1"/>
+              </w:rPr>
+            </w:pPr>
+            <w:r>
+              <w:rPr>
+                <w:rFonts w:ascii="仿宋" w:eastAsia="仿宋" w:hAnsi="仿宋" w:hint="eastAsia"/>
+                <w:color w:val="000000" w:themeColor="text1"/>
+              </w:rPr>
+              <w:t>□开源  □获得授权</w:t>
+            </w:r>
+          </w:p>
+          <w:p>
+            <w:pPr>
+              <w:rPr>
+                <w:rFonts w:ascii="仿宋" w:eastAsia="仿宋" w:hAnsi="仿宋" w:hint="eastAsia"/>
+                <w:color w:val="000000" w:themeColor="text1"/>
+              </w:rPr>
+            </w:pPr>
+            <w:r>
+              <w:rPr>
+                <w:rFonts w:ascii="仿宋" w:eastAsia="仿宋" w:hAnsi="仿宋"/>
+                <w:smallCaps/>
+                <w:color w:val="000000" w:themeColor="text1"/>
+                <w:u w:val="single"/>
+              </w:rPr>
+              <w:t xml:space="preserve">                      </w:t>
+            </w:r>
+            <w:r>
+              <w:rPr>
+                <w:rFonts w:ascii="仿宋" w:eastAsia="仿宋" w:hAnsi="仿宋"/>
+                <w:color w:val="000000" w:themeColor="text1"/>
+                <w:u w:val="single"/>
+              </w:rPr>
+              <w:t xml:space="preserve">   </w:t>
             </w:r>
           </w:p>
         </w:tc>
@@ -2449,27 +3388,30 @@
           </w:tcPr>
           <w:p>
             <w:pPr>
-              <w:spacing w:after="0"/>
-            </w:pPr>
-            <w:r/>
-            <w:r>
-              <w:rPr>
-                <w:rFonts w:ascii="微软雅黑" w:hAnsi="微软雅黑" w:eastAsia="微软雅黑"/>
-                <w:b w:val="0"/>
-                <w:sz w:val="18"/>
+              <w:rPr>
+                <w:rFonts w:ascii="仿宋" w:eastAsia="仿宋" w:hAnsi="仿宋" w:hint="eastAsia"/>
+                <w:color w:val="000000" w:themeColor="text1"/>
+              </w:rPr>
+            </w:pPr>
+            <w:r>
+              <w:rPr>
+                <w:rFonts w:ascii="仿宋" w:eastAsia="仿宋" w:hAnsi="仿宋" w:hint="eastAsia"/>
+                <w:color w:val="000000" w:themeColor="text1"/>
               </w:rPr>
               <w:t>文件名：1 文档/答辩演示相关文档</w:t>
             </w:r>
           </w:p>
           <w:p>
             <w:pPr>
-              <w:spacing w:after="0"/>
-            </w:pPr>
-            <w:r>
-              <w:rPr>
-                <w:rFonts w:ascii="微软雅黑" w:hAnsi="微软雅黑" w:eastAsia="微软雅黑"/>
-                <w:b w:val="0"/>
-                <w:sz w:val="18"/>
+              <w:rPr>
+                <w:rFonts w:ascii="仿宋" w:eastAsia="仿宋" w:hAnsi="仿宋" w:hint="eastAsia"/>
+                <w:color w:val="000000" w:themeColor="text1"/>
+              </w:rPr>
+            </w:pPr>
+            <w:r>
+              <w:rPr>
+                <w:rFonts w:ascii="仿宋" w:eastAsia="仿宋" w:hAnsi="仿宋" w:hint="eastAsia"/>
+                <w:color w:val="000000" w:themeColor="text1"/>
               </w:rPr>
               <w:t>描述：包含作品信息概要表、设计和开发文档、讲稿与视频脚本等正式说明材料。</w:t>
             </w:r>
@@ -2483,16 +3425,73 @@
           </w:tcPr>
           <w:p>
             <w:pPr>
-              <w:spacing w:after="0"/>
-            </w:pPr>
-            <w:r/>
-            <w:r>
-              <w:rPr>
-                <w:rFonts w:ascii="微软雅黑" w:hAnsi="微软雅黑" w:eastAsia="微软雅黑"/>
-                <w:b w:val="0"/>
-                <w:sz w:val="18"/>
+              <w:rPr>
+                <w:rFonts w:ascii="仿宋" w:eastAsia="仿宋" w:hAnsi="仿宋" w:hint="eastAsia"/>
+                <w:color w:val="000000" w:themeColor="text1"/>
+              </w:rPr>
+            </w:pPr>
+            <w:r>
+              <w:rPr>
+                <w:rFonts w:ascii="仿宋" w:eastAsia="仿宋" w:hAnsi="仿宋" w:hint="eastAsia"/>
+                <w:color w:val="000000" w:themeColor="text1"/>
               </w:rPr>
               <w:t>■已上传到网盘</w:t>
+            </w:r>
+          </w:p>
+          <w:p>
+            <w:pPr>
+              <w:rPr>
+                <w:rFonts w:ascii="仿宋" w:eastAsia="仿宋" w:hAnsi="仿宋" w:hint="eastAsia"/>
+                <w:color w:val="000000" w:themeColor="text1"/>
+              </w:rPr>
+            </w:pPr>
+            <w:r>
+              <w:rPr>
+                <w:rFonts w:ascii="仿宋" w:eastAsia="仿宋" w:hAnsi="仿宋" w:hint="eastAsia"/>
+                <w:color w:val="000000" w:themeColor="text1"/>
+              </w:rPr>
+              <w:t>□未上传，下载地址：</w:t>
+            </w:r>
+          </w:p>
+          <w:p>
+            <w:pPr>
+              <w:rPr>
+                <w:rFonts w:ascii="仿宋" w:eastAsia="仿宋" w:hAnsi="仿宋" w:hint="eastAsia"/>
+                <w:color w:val="000000" w:themeColor="text1"/>
+              </w:rPr>
+            </w:pPr>
+            <w:r>
+              <w:rPr>
+                <w:rFonts w:ascii="仿宋" w:eastAsia="仿宋" w:hAnsi="仿宋"/>
+                <w:color w:val="000000" w:themeColor="text1"/>
+                <w:u w:val="single"/>
+              </w:rPr>
+              <w:tab/>
+            </w:r>
+            <w:r>
+              <w:rPr>
+                <w:rFonts w:ascii="仿宋" w:eastAsia="仿宋" w:hAnsi="仿宋"/>
+                <w:color w:val="000000" w:themeColor="text1"/>
+                <w:u w:val="single"/>
+              </w:rPr>
+              <w:tab/>
+            </w:r>
+            <w:r>
+              <w:rPr>
+                <w:rFonts w:ascii="仿宋" w:eastAsia="仿宋" w:hAnsi="仿宋"/>
+                <w:color w:val="000000" w:themeColor="text1"/>
+                <w:u w:val="single"/>
+              </w:rPr>
+              <w:tab/>
+            </w:r>
+            <w:r>
+              <w:rPr>
+                <w:rFonts w:ascii="仿宋" w:eastAsia="仿宋" w:hAnsi="仿宋"/>
+                <w:color w:val="000000" w:themeColor="text1"/>
+                <w:u w:val="single"/>
+              </w:rPr>
+              <w:tab/>
+              <w:t xml:space="preserve">     </w:t>
             </w:r>
           </w:p>
         </w:tc>
@@ -2504,16 +3503,73 @@
           </w:tcPr>
           <w:p>
             <w:pPr>
-              <w:spacing w:after="0"/>
-            </w:pPr>
-            <w:r/>
-            <w:r>
-              <w:rPr>
-                <w:rFonts w:ascii="微软雅黑" w:hAnsi="微软雅黑" w:eastAsia="微软雅黑"/>
-                <w:b w:val="0"/>
-                <w:sz w:val="18"/>
-              </w:rPr>
-              <w:t>■自制</w:t>
+              <w:rPr>
+                <w:rFonts w:ascii="仿宋" w:eastAsia="仿宋" w:hAnsi="仿宋" w:hint="eastAsia"/>
+                <w:color w:val="000000" w:themeColor="text1"/>
+              </w:rPr>
+            </w:pPr>
+            <w:r>
+              <w:rPr>
+                <w:rFonts w:ascii="仿宋" w:eastAsia="仿宋" w:hAnsi="仿宋" w:hint="eastAsia"/>
+                <w:color w:val="000000" w:themeColor="text1"/>
+              </w:rPr>
+              <w:t>■自制  □未知版权</w:t>
+            </w:r>
+          </w:p>
+          <w:p>
+            <w:pPr>
+              <w:rPr>
+                <w:rFonts w:ascii="仿宋" w:eastAsia="仿宋" w:hAnsi="仿宋" w:hint="eastAsia"/>
+                <w:color w:val="000000" w:themeColor="text1"/>
+              </w:rPr>
+            </w:pPr>
+            <w:r>
+              <w:rPr>
+                <w:rFonts w:ascii="仿宋" w:eastAsia="仿宋" w:hAnsi="仿宋" w:hint="eastAsia"/>
+                <w:color w:val="000000" w:themeColor="text1"/>
+              </w:rPr>
+              <w:t>□开源  □获得授权</w:t>
+            </w:r>
+          </w:p>
+          <w:p>
+            <w:pPr>
+              <w:rPr>
+                <w:rFonts w:ascii="仿宋" w:eastAsia="仿宋" w:hAnsi="仿宋" w:hint="eastAsia"/>
+                <w:color w:val="000000" w:themeColor="text1"/>
+              </w:rPr>
+            </w:pPr>
+            <w:r>
+              <w:rPr>
+                <w:rFonts w:ascii="仿宋" w:eastAsia="仿宋" w:hAnsi="仿宋"/>
+                <w:color w:val="000000" w:themeColor="text1"/>
+                <w:u w:val="single"/>
+              </w:rPr>
+              <w:tab/>
+            </w:r>
+            <w:r>
+              <w:rPr>
+                <w:rFonts w:ascii="仿宋" w:eastAsia="仿宋" w:hAnsi="仿宋"/>
+                <w:color w:val="000000" w:themeColor="text1"/>
+                <w:u w:val="single"/>
+              </w:rPr>
+              <w:tab/>
+            </w:r>
+            <w:r>
+              <w:rPr>
+                <w:rFonts w:ascii="仿宋" w:eastAsia="仿宋" w:hAnsi="仿宋"/>
+                <w:color w:val="000000" w:themeColor="text1"/>
+                <w:u w:val="single"/>
+              </w:rPr>
+              <w:tab/>
+            </w:r>
+            <w:r>
+              <w:rPr>
+                <w:rFonts w:ascii="仿宋" w:eastAsia="仿宋" w:hAnsi="仿宋"/>
+                <w:color w:val="000000" w:themeColor="text1"/>
+                <w:u w:val="single"/>
+              </w:rPr>
+              <w:tab/>
+              <w:t xml:space="preserve">  </w:t>
             </w:r>
           </w:p>
         </w:tc>
@@ -2552,27 +3608,30 @@
           </w:tcPr>
           <w:p>
             <w:pPr>
-              <w:spacing w:after="0"/>
-            </w:pPr>
-            <w:r/>
-            <w:r>
-              <w:rPr>
-                <w:rFonts w:ascii="微软雅黑" w:hAnsi="微软雅黑" w:eastAsia="微软雅黑"/>
-                <w:b w:val="0"/>
-                <w:sz w:val="18"/>
+              <w:rPr>
+                <w:rFonts w:ascii="仿宋" w:eastAsia="仿宋" w:hAnsi="仿宋" w:hint="eastAsia"/>
+                <w:color w:val="000000" w:themeColor="text1"/>
+              </w:rPr>
+            </w:pPr>
+            <w:r>
+              <w:rPr>
+                <w:rFonts w:ascii="仿宋" w:eastAsia="仿宋" w:hAnsi="仿宋" w:hint="eastAsia"/>
+                <w:color w:val="000000" w:themeColor="text1"/>
               </w:rPr>
               <w:t>文件名：2 创作素材/网站截图与插图</w:t>
             </w:r>
           </w:p>
           <w:p>
             <w:pPr>
-              <w:spacing w:after="0"/>
-            </w:pPr>
-            <w:r>
-              <w:rPr>
-                <w:rFonts w:ascii="微软雅黑" w:hAnsi="微软雅黑" w:eastAsia="微软雅黑"/>
-                <w:b w:val="0"/>
-                <w:sz w:val="18"/>
+              <w:rPr>
+                <w:rFonts w:ascii="仿宋" w:eastAsia="仿宋" w:hAnsi="仿宋" w:hint="eastAsia"/>
+                <w:color w:val="000000" w:themeColor="text1"/>
+              </w:rPr>
+            </w:pPr>
+            <w:r>
+              <w:rPr>
+                <w:rFonts w:ascii="仿宋" w:eastAsia="仿宋" w:hAnsi="仿宋" w:hint="eastAsia"/>
+                <w:color w:val="000000" w:themeColor="text1"/>
               </w:rPr>
               <w:t>描述：真实网站截图、系统架构图和核心流程图等创作素材。</w:t>
             </w:r>
@@ -2586,16 +3645,73 @@
           </w:tcPr>
           <w:p>
             <w:pPr>
-              <w:spacing w:after="0"/>
-            </w:pPr>
-            <w:r/>
-            <w:r>
-              <w:rPr>
-                <w:rFonts w:ascii="微软雅黑" w:hAnsi="微软雅黑" w:eastAsia="微软雅黑"/>
-                <w:b w:val="0"/>
-                <w:sz w:val="18"/>
+              <w:rPr>
+                <w:rFonts w:ascii="仿宋" w:eastAsia="仿宋" w:hAnsi="仿宋" w:hint="eastAsia"/>
+                <w:color w:val="000000" w:themeColor="text1"/>
+              </w:rPr>
+            </w:pPr>
+            <w:r>
+              <w:rPr>
+                <w:rFonts w:ascii="仿宋" w:eastAsia="仿宋" w:hAnsi="仿宋" w:hint="eastAsia"/>
+                <w:color w:val="000000" w:themeColor="text1"/>
               </w:rPr>
               <w:t>■已上传到网盘</w:t>
+            </w:r>
+          </w:p>
+          <w:p>
+            <w:pPr>
+              <w:rPr>
+                <w:rFonts w:ascii="仿宋" w:eastAsia="仿宋" w:hAnsi="仿宋" w:hint="eastAsia"/>
+                <w:color w:val="000000" w:themeColor="text1"/>
+              </w:rPr>
+            </w:pPr>
+            <w:r>
+              <w:rPr>
+                <w:rFonts w:ascii="仿宋" w:eastAsia="仿宋" w:hAnsi="仿宋" w:hint="eastAsia"/>
+                <w:color w:val="000000" w:themeColor="text1"/>
+              </w:rPr>
+              <w:t>□未上传，下载地址：</w:t>
+            </w:r>
+          </w:p>
+          <w:p>
+            <w:pPr>
+              <w:rPr>
+                <w:rFonts w:ascii="仿宋" w:eastAsia="仿宋" w:hAnsi="仿宋" w:hint="eastAsia"/>
+                <w:color w:val="000000" w:themeColor="text1"/>
+              </w:rPr>
+            </w:pPr>
+            <w:r>
+              <w:rPr>
+                <w:rFonts w:ascii="仿宋" w:eastAsia="仿宋" w:hAnsi="仿宋"/>
+                <w:color w:val="000000" w:themeColor="text1"/>
+                <w:u w:val="single"/>
+              </w:rPr>
+              <w:tab/>
+            </w:r>
+            <w:r>
+              <w:rPr>
+                <w:rFonts w:ascii="仿宋" w:eastAsia="仿宋" w:hAnsi="仿宋"/>
+                <w:color w:val="000000" w:themeColor="text1"/>
+                <w:u w:val="single"/>
+              </w:rPr>
+              <w:tab/>
+            </w:r>
+            <w:r>
+              <w:rPr>
+                <w:rFonts w:ascii="仿宋" w:eastAsia="仿宋" w:hAnsi="仿宋"/>
+                <w:color w:val="000000" w:themeColor="text1"/>
+                <w:u w:val="single"/>
+              </w:rPr>
+              <w:tab/>
+            </w:r>
+            <w:r>
+              <w:rPr>
+                <w:rFonts w:ascii="仿宋" w:eastAsia="仿宋" w:hAnsi="仿宋"/>
+                <w:color w:val="000000" w:themeColor="text1"/>
+                <w:u w:val="single"/>
+              </w:rPr>
+              <w:tab/>
+              <w:t xml:space="preserve">     </w:t>
             </w:r>
           </w:p>
         </w:tc>
@@ -2607,16 +3723,73 @@
           </w:tcPr>
           <w:p>
             <w:pPr>
-              <w:spacing w:after="0"/>
-            </w:pPr>
-            <w:r/>
-            <w:r>
-              <w:rPr>
-                <w:rFonts w:ascii="微软雅黑" w:hAnsi="微软雅黑" w:eastAsia="微软雅黑"/>
-                <w:b w:val="0"/>
-                <w:sz w:val="18"/>
-              </w:rPr>
-              <w:t>■自制</w:t>
+              <w:rPr>
+                <w:rFonts w:ascii="仿宋" w:eastAsia="仿宋" w:hAnsi="仿宋" w:hint="eastAsia"/>
+                <w:color w:val="000000" w:themeColor="text1"/>
+              </w:rPr>
+            </w:pPr>
+            <w:r>
+              <w:rPr>
+                <w:rFonts w:ascii="仿宋" w:eastAsia="仿宋" w:hAnsi="仿宋" w:hint="eastAsia"/>
+                <w:color w:val="000000" w:themeColor="text1"/>
+              </w:rPr>
+              <w:t>■自制  □未知版权</w:t>
+            </w:r>
+          </w:p>
+          <w:p>
+            <w:pPr>
+              <w:rPr>
+                <w:rFonts w:ascii="仿宋" w:eastAsia="仿宋" w:hAnsi="仿宋" w:hint="eastAsia"/>
+                <w:color w:val="000000" w:themeColor="text1"/>
+              </w:rPr>
+            </w:pPr>
+            <w:r>
+              <w:rPr>
+                <w:rFonts w:ascii="仿宋" w:eastAsia="仿宋" w:hAnsi="仿宋" w:hint="eastAsia"/>
+                <w:color w:val="000000" w:themeColor="text1"/>
+              </w:rPr>
+              <w:t>□开源  □获得授权</w:t>
+            </w:r>
+          </w:p>
+          <w:p>
+            <w:pPr>
+              <w:rPr>
+                <w:rFonts w:ascii="仿宋" w:eastAsia="仿宋" w:hAnsi="仿宋" w:hint="eastAsia"/>
+                <w:color w:val="000000" w:themeColor="text1"/>
+              </w:rPr>
+            </w:pPr>
+            <w:r>
+              <w:rPr>
+                <w:rFonts w:ascii="仿宋" w:eastAsia="仿宋" w:hAnsi="仿宋"/>
+                <w:color w:val="000000" w:themeColor="text1"/>
+                <w:u w:val="single"/>
+              </w:rPr>
+              <w:tab/>
+            </w:r>
+            <w:r>
+              <w:rPr>
+                <w:rFonts w:ascii="仿宋" w:eastAsia="仿宋" w:hAnsi="仿宋"/>
+                <w:color w:val="000000" w:themeColor="text1"/>
+                <w:u w:val="single"/>
+              </w:rPr>
+              <w:tab/>
+            </w:r>
+            <w:r>
+              <w:rPr>
+                <w:rFonts w:ascii="仿宋" w:eastAsia="仿宋" w:hAnsi="仿宋"/>
+                <w:color w:val="000000" w:themeColor="text1"/>
+                <w:u w:val="single"/>
+              </w:rPr>
+              <w:tab/>
+            </w:r>
+            <w:r>
+              <w:rPr>
+                <w:rFonts w:ascii="仿宋" w:eastAsia="仿宋" w:hAnsi="仿宋"/>
+                <w:color w:val="000000" w:themeColor="text1"/>
+                <w:u w:val="single"/>
+              </w:rPr>
+              <w:tab/>
+              <w:t xml:space="preserve">  </w:t>
             </w:r>
           </w:p>
         </w:tc>
@@ -2655,27 +3828,30 @@
           </w:tcPr>
           <w:p>
             <w:pPr>
-              <w:spacing w:after="0"/>
-            </w:pPr>
-            <w:r/>
-            <w:r>
-              <w:rPr>
-                <w:rFonts w:ascii="微软雅黑" w:hAnsi="微软雅黑" w:eastAsia="微软雅黑"/>
-                <w:b w:val="0"/>
-                <w:sz w:val="18"/>
+              <w:rPr>
+                <w:rFonts w:ascii="仿宋" w:eastAsia="仿宋" w:hAnsi="仿宋" w:hint="eastAsia"/>
+                <w:color w:val="000000" w:themeColor="text1"/>
+              </w:rPr>
+            </w:pPr>
+            <w:r>
+              <w:rPr>
+                <w:rFonts w:ascii="仿宋" w:eastAsia="仿宋" w:hAnsi="仿宋" w:hint="eastAsia"/>
+                <w:color w:val="000000" w:themeColor="text1"/>
               </w:rPr>
               <w:t>文件名：3 作品/源码包.zip</w:t>
             </w:r>
           </w:p>
           <w:p>
             <w:pPr>
-              <w:spacing w:after="0"/>
-            </w:pPr>
-            <w:r>
-              <w:rPr>
-                <w:rFonts w:ascii="微软雅黑" w:hAnsi="微软雅黑" w:eastAsia="微软雅黑"/>
-                <w:b w:val="0"/>
-                <w:sz w:val="18"/>
+              <w:rPr>
+                <w:rFonts w:ascii="仿宋" w:eastAsia="仿宋" w:hAnsi="仿宋" w:hint="eastAsia"/>
+                <w:color w:val="000000" w:themeColor="text1"/>
+              </w:rPr>
+            </w:pPr>
+            <w:r>
+              <w:rPr>
+                <w:rFonts w:ascii="仿宋" w:eastAsia="仿宋" w:hAnsi="仿宋" w:hint="eastAsia"/>
+                <w:color w:val="000000" w:themeColor="text1"/>
               </w:rPr>
               <w:t>描述：提交用源码压缩包，包含后端、Web、小程序、Docker与文档等代表性源码。</w:t>
             </w:r>
@@ -2689,16 +3865,73 @@
           </w:tcPr>
           <w:p>
             <w:pPr>
-              <w:spacing w:after="0"/>
-            </w:pPr>
-            <w:r/>
-            <w:r>
-              <w:rPr>
-                <w:rFonts w:ascii="微软雅黑" w:hAnsi="微软雅黑" w:eastAsia="微软雅黑"/>
-                <w:b w:val="0"/>
-                <w:sz w:val="18"/>
+              <w:rPr>
+                <w:rFonts w:ascii="仿宋" w:eastAsia="仿宋" w:hAnsi="仿宋" w:hint="eastAsia"/>
+                <w:color w:val="000000" w:themeColor="text1"/>
+              </w:rPr>
+            </w:pPr>
+            <w:r>
+              <w:rPr>
+                <w:rFonts w:ascii="仿宋" w:eastAsia="仿宋" w:hAnsi="仿宋" w:hint="eastAsia"/>
+                <w:color w:val="000000" w:themeColor="text1"/>
               </w:rPr>
               <w:t>■已上传到网盘</w:t>
+            </w:r>
+          </w:p>
+          <w:p>
+            <w:pPr>
+              <w:rPr>
+                <w:rFonts w:ascii="仿宋" w:eastAsia="仿宋" w:hAnsi="仿宋" w:hint="eastAsia"/>
+                <w:color w:val="000000" w:themeColor="text1"/>
+              </w:rPr>
+            </w:pPr>
+            <w:r>
+              <w:rPr>
+                <w:rFonts w:ascii="仿宋" w:eastAsia="仿宋" w:hAnsi="仿宋" w:hint="eastAsia"/>
+                <w:color w:val="000000" w:themeColor="text1"/>
+              </w:rPr>
+              <w:t>□未上传，下载地址：</w:t>
+            </w:r>
+          </w:p>
+          <w:p>
+            <w:pPr>
+              <w:rPr>
+                <w:rFonts w:ascii="仿宋" w:eastAsia="仿宋" w:hAnsi="仿宋" w:hint="eastAsia"/>
+                <w:color w:val="000000" w:themeColor="text1"/>
+              </w:rPr>
+            </w:pPr>
+            <w:r>
+              <w:rPr>
+                <w:rFonts w:ascii="仿宋" w:eastAsia="仿宋" w:hAnsi="仿宋"/>
+                <w:color w:val="000000" w:themeColor="text1"/>
+                <w:u w:val="single"/>
+              </w:rPr>
+              <w:tab/>
+            </w:r>
+            <w:r>
+              <w:rPr>
+                <w:rFonts w:ascii="仿宋" w:eastAsia="仿宋" w:hAnsi="仿宋"/>
+                <w:color w:val="000000" w:themeColor="text1"/>
+                <w:u w:val="single"/>
+              </w:rPr>
+              <w:tab/>
+            </w:r>
+            <w:r>
+              <w:rPr>
+                <w:rFonts w:ascii="仿宋" w:eastAsia="仿宋" w:hAnsi="仿宋"/>
+                <w:color w:val="000000" w:themeColor="text1"/>
+                <w:u w:val="single"/>
+              </w:rPr>
+              <w:tab/>
+            </w:r>
+            <w:r>
+              <w:rPr>
+                <w:rFonts w:ascii="仿宋" w:eastAsia="仿宋" w:hAnsi="仿宋"/>
+                <w:color w:val="000000" w:themeColor="text1"/>
+                <w:u w:val="single"/>
+              </w:rPr>
+              <w:tab/>
+              <w:t xml:space="preserve">     </w:t>
             </w:r>
           </w:p>
         </w:tc>
@@ -2710,16 +3943,73 @@
           </w:tcPr>
           <w:p>
             <w:pPr>
-              <w:spacing w:after="0"/>
-            </w:pPr>
-            <w:r/>
-            <w:r>
-              <w:rPr>
-                <w:rFonts w:ascii="微软雅黑" w:hAnsi="微软雅黑" w:eastAsia="微软雅黑"/>
-                <w:b w:val="0"/>
-                <w:sz w:val="18"/>
-              </w:rPr>
-              <w:t>■自制</w:t>
+              <w:rPr>
+                <w:rFonts w:ascii="仿宋" w:eastAsia="仿宋" w:hAnsi="仿宋" w:hint="eastAsia"/>
+                <w:color w:val="000000" w:themeColor="text1"/>
+              </w:rPr>
+            </w:pPr>
+            <w:r>
+              <w:rPr>
+                <w:rFonts w:ascii="仿宋" w:eastAsia="仿宋" w:hAnsi="仿宋" w:hint="eastAsia"/>
+                <w:color w:val="000000" w:themeColor="text1"/>
+              </w:rPr>
+              <w:t>■自制  □未知版权</w:t>
+            </w:r>
+          </w:p>
+          <w:p>
+            <w:pPr>
+              <w:rPr>
+                <w:rFonts w:ascii="仿宋" w:eastAsia="仿宋" w:hAnsi="仿宋" w:hint="eastAsia"/>
+                <w:color w:val="000000" w:themeColor="text1"/>
+              </w:rPr>
+            </w:pPr>
+            <w:r>
+              <w:rPr>
+                <w:rFonts w:ascii="仿宋" w:eastAsia="仿宋" w:hAnsi="仿宋" w:hint="eastAsia"/>
+                <w:color w:val="000000" w:themeColor="text1"/>
+              </w:rPr>
+              <w:t>□开源  □获得授权</w:t>
+            </w:r>
+          </w:p>
+          <w:p>
+            <w:pPr>
+              <w:rPr>
+                <w:rFonts w:ascii="仿宋" w:eastAsia="仿宋" w:hAnsi="仿宋" w:hint="eastAsia"/>
+                <w:color w:val="000000" w:themeColor="text1"/>
+              </w:rPr>
+            </w:pPr>
+            <w:r>
+              <w:rPr>
+                <w:rFonts w:ascii="仿宋" w:eastAsia="仿宋" w:hAnsi="仿宋"/>
+                <w:color w:val="000000" w:themeColor="text1"/>
+                <w:u w:val="single"/>
+              </w:rPr>
+              <w:tab/>
+            </w:r>
+            <w:r>
+              <w:rPr>
+                <w:rFonts w:ascii="仿宋" w:eastAsia="仿宋" w:hAnsi="仿宋"/>
+                <w:color w:val="000000" w:themeColor="text1"/>
+                <w:u w:val="single"/>
+              </w:rPr>
+              <w:tab/>
+            </w:r>
+            <w:r>
+              <w:rPr>
+                <w:rFonts w:ascii="仿宋" w:eastAsia="仿宋" w:hAnsi="仿宋"/>
+                <w:color w:val="000000" w:themeColor="text1"/>
+                <w:u w:val="single"/>
+              </w:rPr>
+              <w:tab/>
+            </w:r>
+            <w:r>
+              <w:rPr>
+                <w:rFonts w:ascii="仿宋" w:eastAsia="仿宋" w:hAnsi="仿宋"/>
+                <w:color w:val="000000" w:themeColor="text1"/>
+                <w:u w:val="single"/>
+              </w:rPr>
+              <w:tab/>
+              <w:t xml:space="preserve">  </w:t>
             </w:r>
           </w:p>
         </w:tc>
@@ -2758,27 +4048,30 @@
           </w:tcPr>
           <w:p>
             <w:pPr>
-              <w:spacing w:after="0"/>
-            </w:pPr>
-            <w:r/>
-            <w:r>
-              <w:rPr>
-                <w:rFonts w:ascii="微软雅黑" w:hAnsi="微软雅黑" w:eastAsia="微软雅黑"/>
-                <w:b w:val="0"/>
-                <w:sz w:val="18"/>
+              <w:rPr>
+                <w:rFonts w:ascii="仿宋" w:eastAsia="仿宋" w:hAnsi="仿宋" w:hint="eastAsia"/>
+                <w:color w:val="000000" w:themeColor="text1"/>
+              </w:rPr>
+            </w:pPr>
+            <w:r>
+              <w:rPr>
+                <w:rFonts w:ascii="仿宋" w:eastAsia="仿宋" w:hAnsi="仿宋" w:hint="eastAsia"/>
+                <w:color w:val="000000" w:themeColor="text1"/>
               </w:rPr>
               <w:t>文件名：3 作品/答辩演示PPT</w:t>
             </w:r>
           </w:p>
           <w:p>
             <w:pPr>
-              <w:spacing w:after="0"/>
-            </w:pPr>
-            <w:r>
-              <w:rPr>
-                <w:rFonts w:ascii="微软雅黑" w:hAnsi="微软雅黑" w:eastAsia="微软雅黑"/>
-                <w:b w:val="0"/>
-                <w:sz w:val="18"/>
+              <w:rPr>
+                <w:rFonts w:ascii="仿宋" w:eastAsia="仿宋" w:hAnsi="仿宋" w:hint="eastAsia"/>
+                <w:color w:val="000000" w:themeColor="text1"/>
+              </w:rPr>
+            </w:pPr>
+            <w:r>
+              <w:rPr>
+                <w:rFonts w:ascii="仿宋" w:eastAsia="仿宋" w:hAnsi="仿宋" w:hint="eastAsia"/>
+                <w:color w:val="000000" w:themeColor="text1"/>
               </w:rPr>
               <w:t>描述：实际答辩演示PPT，含首页、架构、核心功能、测试与总结等正式答辩页。</w:t>
             </w:r>
@@ -2792,16 +4085,73 @@
           </w:tcPr>
           <w:p>
             <w:pPr>
-              <w:spacing w:after="0"/>
-            </w:pPr>
-            <w:r/>
-            <w:r>
-              <w:rPr>
-                <w:rFonts w:ascii="微软雅黑" w:hAnsi="微软雅黑" w:eastAsia="微软雅黑"/>
-                <w:b w:val="0"/>
-                <w:sz w:val="18"/>
+              <w:rPr>
+                <w:rFonts w:ascii="仿宋" w:eastAsia="仿宋" w:hAnsi="仿宋" w:hint="eastAsia"/>
+                <w:color w:val="000000" w:themeColor="text1"/>
+              </w:rPr>
+            </w:pPr>
+            <w:r>
+              <w:rPr>
+                <w:rFonts w:ascii="仿宋" w:eastAsia="仿宋" w:hAnsi="仿宋" w:hint="eastAsia"/>
+                <w:color w:val="000000" w:themeColor="text1"/>
               </w:rPr>
               <w:t>■已上传到网盘</w:t>
+            </w:r>
+          </w:p>
+          <w:p>
+            <w:pPr>
+              <w:rPr>
+                <w:rFonts w:ascii="仿宋" w:eastAsia="仿宋" w:hAnsi="仿宋" w:hint="eastAsia"/>
+                <w:color w:val="000000" w:themeColor="text1"/>
+              </w:rPr>
+            </w:pPr>
+            <w:r>
+              <w:rPr>
+                <w:rFonts w:ascii="仿宋" w:eastAsia="仿宋" w:hAnsi="仿宋" w:hint="eastAsia"/>
+                <w:color w:val="000000" w:themeColor="text1"/>
+              </w:rPr>
+              <w:t>□未上传，下载地址：</w:t>
+            </w:r>
+          </w:p>
+          <w:p>
+            <w:pPr>
+              <w:rPr>
+                <w:rFonts w:ascii="仿宋" w:eastAsia="仿宋" w:hAnsi="仿宋" w:hint="eastAsia"/>
+                <w:color w:val="000000" w:themeColor="text1"/>
+              </w:rPr>
+            </w:pPr>
+            <w:r>
+              <w:rPr>
+                <w:rFonts w:ascii="仿宋" w:eastAsia="仿宋" w:hAnsi="仿宋"/>
+                <w:color w:val="000000" w:themeColor="text1"/>
+                <w:u w:val="single"/>
+              </w:rPr>
+              <w:tab/>
+            </w:r>
+            <w:r>
+              <w:rPr>
+                <w:rFonts w:ascii="仿宋" w:eastAsia="仿宋" w:hAnsi="仿宋"/>
+                <w:color w:val="000000" w:themeColor="text1"/>
+                <w:u w:val="single"/>
+              </w:rPr>
+              <w:tab/>
+            </w:r>
+            <w:r>
+              <w:rPr>
+                <w:rFonts w:ascii="仿宋" w:eastAsia="仿宋" w:hAnsi="仿宋"/>
+                <w:color w:val="000000" w:themeColor="text1"/>
+                <w:u w:val="single"/>
+              </w:rPr>
+              <w:tab/>
+            </w:r>
+            <w:r>
+              <w:rPr>
+                <w:rFonts w:ascii="仿宋" w:eastAsia="仿宋" w:hAnsi="仿宋"/>
+                <w:color w:val="000000" w:themeColor="text1"/>
+                <w:u w:val="single"/>
+              </w:rPr>
+              <w:tab/>
+              <w:t xml:space="preserve">     </w:t>
             </w:r>
           </w:p>
         </w:tc>
@@ -2813,16 +4163,73 @@
           </w:tcPr>
           <w:p>
             <w:pPr>
-              <w:spacing w:after="0"/>
-            </w:pPr>
-            <w:r/>
-            <w:r>
-              <w:rPr>
-                <w:rFonts w:ascii="微软雅黑" w:hAnsi="微软雅黑" w:eastAsia="微软雅黑"/>
-                <w:b w:val="0"/>
-                <w:sz w:val="18"/>
-              </w:rPr>
-              <w:t>■自制</w:t>
+              <w:rPr>
+                <w:rFonts w:ascii="仿宋" w:eastAsia="仿宋" w:hAnsi="仿宋" w:hint="eastAsia"/>
+                <w:color w:val="000000" w:themeColor="text1"/>
+              </w:rPr>
+            </w:pPr>
+            <w:r>
+              <w:rPr>
+                <w:rFonts w:ascii="仿宋" w:eastAsia="仿宋" w:hAnsi="仿宋" w:hint="eastAsia"/>
+                <w:color w:val="000000" w:themeColor="text1"/>
+              </w:rPr>
+              <w:t>■自制  □未知版权</w:t>
+            </w:r>
+          </w:p>
+          <w:p>
+            <w:pPr>
+              <w:rPr>
+                <w:rFonts w:ascii="仿宋" w:eastAsia="仿宋" w:hAnsi="仿宋" w:hint="eastAsia"/>
+                <w:color w:val="000000" w:themeColor="text1"/>
+              </w:rPr>
+            </w:pPr>
+            <w:r>
+              <w:rPr>
+                <w:rFonts w:ascii="仿宋" w:eastAsia="仿宋" w:hAnsi="仿宋" w:hint="eastAsia"/>
+                <w:color w:val="000000" w:themeColor="text1"/>
+              </w:rPr>
+              <w:t>□开源  □获得授权</w:t>
+            </w:r>
+          </w:p>
+          <w:p>
+            <w:pPr>
+              <w:rPr>
+                <w:rFonts w:ascii="仿宋" w:eastAsia="仿宋" w:hAnsi="仿宋" w:hint="eastAsia"/>
+                <w:color w:val="000000" w:themeColor="text1"/>
+              </w:rPr>
+            </w:pPr>
+            <w:r>
+              <w:rPr>
+                <w:rFonts w:ascii="仿宋" w:eastAsia="仿宋" w:hAnsi="仿宋"/>
+                <w:color w:val="000000" w:themeColor="text1"/>
+                <w:u w:val="single"/>
+              </w:rPr>
+              <w:tab/>
+            </w:r>
+            <w:r>
+              <w:rPr>
+                <w:rFonts w:ascii="仿宋" w:eastAsia="仿宋" w:hAnsi="仿宋"/>
+                <w:color w:val="000000" w:themeColor="text1"/>
+                <w:u w:val="single"/>
+              </w:rPr>
+              <w:tab/>
+            </w:r>
+            <w:r>
+              <w:rPr>
+                <w:rFonts w:ascii="仿宋" w:eastAsia="仿宋" w:hAnsi="仿宋"/>
+                <w:color w:val="000000" w:themeColor="text1"/>
+                <w:u w:val="single"/>
+              </w:rPr>
+              <w:tab/>
+            </w:r>
+            <w:r>
+              <w:rPr>
+                <w:rFonts w:ascii="仿宋" w:eastAsia="仿宋" w:hAnsi="仿宋"/>
+                <w:color w:val="000000" w:themeColor="text1"/>
+                <w:u w:val="single"/>
+              </w:rPr>
+              <w:tab/>
+              <w:t xml:space="preserve">  </w:t>
             </w:r>
           </w:p>
         </w:tc>
@@ -2861,27 +4268,30 @@
           </w:tcPr>
           <w:p>
             <w:pPr>
-              <w:spacing w:after="0"/>
-            </w:pPr>
-            <w:r/>
-            <w:r>
-              <w:rPr>
-                <w:rFonts w:ascii="微软雅黑" w:hAnsi="微软雅黑" w:eastAsia="微软雅黑"/>
-                <w:b w:val="0"/>
-                <w:sz w:val="18"/>
+              <w:rPr>
+                <w:rFonts w:ascii="仿宋" w:eastAsia="仿宋" w:hAnsi="仿宋" w:hint="eastAsia"/>
+                <w:color w:val="000000" w:themeColor="text1"/>
+              </w:rPr>
+            </w:pPr>
+            <w:r>
+              <w:rPr>
+                <w:rFonts w:ascii="仿宋" w:eastAsia="仿宋" w:hAnsi="仿宋" w:hint="eastAsia"/>
+                <w:color w:val="000000" w:themeColor="text1"/>
               </w:rPr>
               <w:t>文件名：3 作品/作品运行演示视频.mp4</w:t>
             </w:r>
           </w:p>
           <w:p>
             <w:pPr>
-              <w:spacing w:after="0"/>
-            </w:pPr>
-            <w:r>
-              <w:rPr>
-                <w:rFonts w:ascii="微软雅黑" w:hAnsi="微软雅黑" w:eastAsia="微软雅黑"/>
-                <w:b w:val="0"/>
-                <w:sz w:val="18"/>
+              <w:rPr>
+                <w:rFonts w:ascii="仿宋" w:eastAsia="仿宋" w:hAnsi="仿宋" w:hint="eastAsia"/>
+                <w:color w:val="000000" w:themeColor="text1"/>
+              </w:rPr>
+            </w:pPr>
+            <w:r>
+              <w:rPr>
+                <w:rFonts w:ascii="仿宋" w:eastAsia="仿宋" w:hAnsi="仿宋" w:hint="eastAsia"/>
+                <w:color w:val="000000" w:themeColor="text1"/>
               </w:rPr>
               <w:t>描述：基于真实网站截图制作的正式演示视频，覆盖首页、题库、考试、论坛与后台等环节。</w:t>
             </w:r>
@@ -2895,16 +4305,73 @@
           </w:tcPr>
           <w:p>
             <w:pPr>
-              <w:spacing w:after="0"/>
-            </w:pPr>
-            <w:r/>
-            <w:r>
-              <w:rPr>
-                <w:rFonts w:ascii="微软雅黑" w:hAnsi="微软雅黑" w:eastAsia="微软雅黑"/>
-                <w:b w:val="0"/>
-                <w:sz w:val="18"/>
+              <w:rPr>
+                <w:rFonts w:ascii="仿宋" w:eastAsia="仿宋" w:hAnsi="仿宋" w:hint="eastAsia"/>
+                <w:color w:val="000000" w:themeColor="text1"/>
+              </w:rPr>
+            </w:pPr>
+            <w:r>
+              <w:rPr>
+                <w:rFonts w:ascii="仿宋" w:eastAsia="仿宋" w:hAnsi="仿宋" w:hint="eastAsia"/>
+                <w:color w:val="000000" w:themeColor="text1"/>
               </w:rPr>
               <w:t>■已上传到网盘</w:t>
+            </w:r>
+          </w:p>
+          <w:p>
+            <w:pPr>
+              <w:rPr>
+                <w:rFonts w:ascii="仿宋" w:eastAsia="仿宋" w:hAnsi="仿宋" w:hint="eastAsia"/>
+                <w:color w:val="000000" w:themeColor="text1"/>
+              </w:rPr>
+            </w:pPr>
+            <w:r>
+              <w:rPr>
+                <w:rFonts w:ascii="仿宋" w:eastAsia="仿宋" w:hAnsi="仿宋" w:hint="eastAsia"/>
+                <w:color w:val="000000" w:themeColor="text1"/>
+              </w:rPr>
+              <w:t>□未上传，下载地址：</w:t>
+            </w:r>
+          </w:p>
+          <w:p>
+            <w:pPr>
+              <w:rPr>
+                <w:rFonts w:ascii="仿宋" w:eastAsia="仿宋" w:hAnsi="仿宋" w:hint="eastAsia"/>
+                <w:color w:val="000000" w:themeColor="text1"/>
+              </w:rPr>
+            </w:pPr>
+            <w:r>
+              <w:rPr>
+                <w:rFonts w:ascii="仿宋" w:eastAsia="仿宋" w:hAnsi="仿宋"/>
+                <w:color w:val="000000" w:themeColor="text1"/>
+                <w:u w:val="single"/>
+              </w:rPr>
+              <w:tab/>
+            </w:r>
+            <w:r>
+              <w:rPr>
+                <w:rFonts w:ascii="仿宋" w:eastAsia="仿宋" w:hAnsi="仿宋"/>
+                <w:color w:val="000000" w:themeColor="text1"/>
+                <w:u w:val="single"/>
+              </w:rPr>
+              <w:tab/>
+            </w:r>
+            <w:r>
+              <w:rPr>
+                <w:rFonts w:ascii="仿宋" w:eastAsia="仿宋" w:hAnsi="仿宋"/>
+                <w:color w:val="000000" w:themeColor="text1"/>
+                <w:u w:val="single"/>
+              </w:rPr>
+              <w:tab/>
+            </w:r>
+            <w:r>
+              <w:rPr>
+                <w:rFonts w:ascii="仿宋" w:eastAsia="仿宋" w:hAnsi="仿宋"/>
+                <w:color w:val="000000" w:themeColor="text1"/>
+                <w:u w:val="single"/>
+              </w:rPr>
+              <w:tab/>
+              <w:t xml:space="preserve">     </w:t>
             </w:r>
           </w:p>
         </w:tc>
@@ -2916,16 +4383,73 @@
           </w:tcPr>
           <w:p>
             <w:pPr>
-              <w:spacing w:after="0"/>
-            </w:pPr>
-            <w:r/>
-            <w:r>
-              <w:rPr>
-                <w:rFonts w:ascii="微软雅黑" w:hAnsi="微软雅黑" w:eastAsia="微软雅黑"/>
-                <w:b w:val="0"/>
-                <w:sz w:val="18"/>
-              </w:rPr>
-              <w:t>■自制</w:t>
+              <w:rPr>
+                <w:rFonts w:ascii="仿宋" w:eastAsia="仿宋" w:hAnsi="仿宋" w:hint="eastAsia"/>
+                <w:color w:val="000000" w:themeColor="text1"/>
+              </w:rPr>
+            </w:pPr>
+            <w:r>
+              <w:rPr>
+                <w:rFonts w:ascii="仿宋" w:eastAsia="仿宋" w:hAnsi="仿宋" w:hint="eastAsia"/>
+                <w:color w:val="000000" w:themeColor="text1"/>
+              </w:rPr>
+              <w:t>■自制  □未知版权</w:t>
+            </w:r>
+          </w:p>
+          <w:p>
+            <w:pPr>
+              <w:rPr>
+                <w:rFonts w:ascii="仿宋" w:eastAsia="仿宋" w:hAnsi="仿宋" w:hint="eastAsia"/>
+                <w:color w:val="000000" w:themeColor="text1"/>
+              </w:rPr>
+            </w:pPr>
+            <w:r>
+              <w:rPr>
+                <w:rFonts w:ascii="仿宋" w:eastAsia="仿宋" w:hAnsi="仿宋" w:hint="eastAsia"/>
+                <w:color w:val="000000" w:themeColor="text1"/>
+              </w:rPr>
+              <w:t>□开源  □获得授权</w:t>
+            </w:r>
+          </w:p>
+          <w:p>
+            <w:pPr>
+              <w:rPr>
+                <w:rFonts w:ascii="仿宋" w:eastAsia="仿宋" w:hAnsi="仿宋" w:hint="eastAsia"/>
+                <w:color w:val="000000" w:themeColor="text1"/>
+              </w:rPr>
+            </w:pPr>
+            <w:r>
+              <w:rPr>
+                <w:rFonts w:ascii="仿宋" w:eastAsia="仿宋" w:hAnsi="仿宋"/>
+                <w:color w:val="000000" w:themeColor="text1"/>
+                <w:u w:val="single"/>
+              </w:rPr>
+              <w:tab/>
+            </w:r>
+            <w:r>
+              <w:rPr>
+                <w:rFonts w:ascii="仿宋" w:eastAsia="仿宋" w:hAnsi="仿宋"/>
+                <w:color w:val="000000" w:themeColor="text1"/>
+                <w:u w:val="single"/>
+              </w:rPr>
+              <w:tab/>
+            </w:r>
+            <w:r>
+              <w:rPr>
+                <w:rFonts w:ascii="仿宋" w:eastAsia="仿宋" w:hAnsi="仿宋"/>
+                <w:color w:val="000000" w:themeColor="text1"/>
+                <w:u w:val="single"/>
+              </w:rPr>
+              <w:tab/>
+            </w:r>
+            <w:r>
+              <w:rPr>
+                <w:rFonts w:ascii="仿宋" w:eastAsia="仿宋" w:hAnsi="仿宋"/>
+                <w:color w:val="000000" w:themeColor="text1"/>
+                <w:u w:val="single"/>
+              </w:rPr>
+              <w:tab/>
+              <w:t xml:space="preserve">  </w:t>
             </w:r>
           </w:p>
         </w:tc>
@@ -2965,27 +4489,30 @@
           </w:tcPr>
           <w:p>
             <w:pPr>
-              <w:spacing w:after="0"/>
-            </w:pPr>
-            <w:r/>
-            <w:r>
-              <w:rPr>
-                <w:rFonts w:ascii="微软雅黑" w:hAnsi="微软雅黑" w:eastAsia="微软雅黑"/>
-                <w:b w:val="0"/>
-                <w:sz w:val="18"/>
+              <w:rPr>
+                <w:rFonts w:ascii="仿宋" w:eastAsia="仿宋" w:hAnsi="仿宋" w:hint="eastAsia"/>
+                <w:color w:val="000000" w:themeColor="text1"/>
+              </w:rPr>
+            </w:pPr>
+            <w:r>
+              <w:rPr>
+                <w:rFonts w:ascii="仿宋" w:eastAsia="仿宋" w:hAnsi="仿宋" w:hint="eastAsia"/>
+                <w:color w:val="000000" w:themeColor="text1"/>
               </w:rPr>
               <w:t>文件名：3 作品/访问地址.txt</w:t>
             </w:r>
           </w:p>
           <w:p>
             <w:pPr>
-              <w:spacing w:after="0"/>
-            </w:pPr>
-            <w:r>
-              <w:rPr>
-                <w:rFonts w:ascii="微软雅黑" w:hAnsi="微软雅黑" w:eastAsia="微软雅黑"/>
-                <w:b w:val="0"/>
-                <w:sz w:val="18"/>
+              <w:rPr>
+                <w:rFonts w:ascii="仿宋" w:eastAsia="仿宋" w:hAnsi="仿宋" w:hint="eastAsia"/>
+                <w:color w:val="000000" w:themeColor="text1"/>
+              </w:rPr>
+            </w:pPr>
+            <w:r>
+              <w:rPr>
+                <w:rFonts w:ascii="仿宋" w:eastAsia="仿宋" w:hAnsi="仿宋" w:hint="eastAsia"/>
+                <w:color w:val="000000" w:themeColor="text1"/>
               </w:rPr>
               <w:t>描述：列出正式公网访问地址与本地演示地址，便于评审快速打开作品。</w:t>
             </w:r>
@@ -2999,16 +4526,73 @@
           </w:tcPr>
           <w:p>
             <w:pPr>
-              <w:spacing w:after="0"/>
-            </w:pPr>
-            <w:r/>
-            <w:r>
-              <w:rPr>
-                <w:rFonts w:ascii="微软雅黑" w:hAnsi="微软雅黑" w:eastAsia="微软雅黑"/>
-                <w:b w:val="0"/>
-                <w:sz w:val="18"/>
+              <w:rPr>
+                <w:rFonts w:ascii="仿宋" w:eastAsia="仿宋" w:hAnsi="仿宋" w:hint="eastAsia"/>
+                <w:color w:val="000000" w:themeColor="text1"/>
+              </w:rPr>
+            </w:pPr>
+            <w:r>
+              <w:rPr>
+                <w:rFonts w:ascii="仿宋" w:eastAsia="仿宋" w:hAnsi="仿宋" w:hint="eastAsia"/>
+                <w:color w:val="000000" w:themeColor="text1"/>
               </w:rPr>
               <w:t>■已上传到网盘</w:t>
+            </w:r>
+          </w:p>
+          <w:p>
+            <w:pPr>
+              <w:rPr>
+                <w:rFonts w:ascii="仿宋" w:eastAsia="仿宋" w:hAnsi="仿宋" w:hint="eastAsia"/>
+                <w:color w:val="000000" w:themeColor="text1"/>
+              </w:rPr>
+            </w:pPr>
+            <w:r>
+              <w:rPr>
+                <w:rFonts w:ascii="仿宋" w:eastAsia="仿宋" w:hAnsi="仿宋" w:hint="eastAsia"/>
+                <w:color w:val="000000" w:themeColor="text1"/>
+              </w:rPr>
+              <w:t>□未上传，下载地址：</w:t>
+            </w:r>
+          </w:p>
+          <w:p>
+            <w:pPr>
+              <w:rPr>
+                <w:rFonts w:ascii="仿宋" w:eastAsia="仿宋" w:hAnsi="仿宋" w:hint="eastAsia"/>
+                <w:color w:val="000000" w:themeColor="text1"/>
+              </w:rPr>
+            </w:pPr>
+            <w:r>
+              <w:rPr>
+                <w:rFonts w:ascii="仿宋" w:eastAsia="仿宋" w:hAnsi="仿宋"/>
+                <w:color w:val="000000" w:themeColor="text1"/>
+                <w:u w:val="single"/>
+              </w:rPr>
+              <w:tab/>
+            </w:r>
+            <w:r>
+              <w:rPr>
+                <w:rFonts w:ascii="仿宋" w:eastAsia="仿宋" w:hAnsi="仿宋"/>
+                <w:color w:val="000000" w:themeColor="text1"/>
+                <w:u w:val="single"/>
+              </w:rPr>
+              <w:tab/>
+            </w:r>
+            <w:r>
+              <w:rPr>
+                <w:rFonts w:ascii="仿宋" w:eastAsia="仿宋" w:hAnsi="仿宋"/>
+                <w:color w:val="000000" w:themeColor="text1"/>
+                <w:u w:val="single"/>
+              </w:rPr>
+              <w:tab/>
+            </w:r>
+            <w:r>
+              <w:rPr>
+                <w:rFonts w:ascii="仿宋" w:eastAsia="仿宋" w:hAnsi="仿宋"/>
+                <w:color w:val="000000" w:themeColor="text1"/>
+                <w:u w:val="single"/>
+              </w:rPr>
+              <w:tab/>
+              <w:t xml:space="preserve">     </w:t>
             </w:r>
           </w:p>
         </w:tc>
@@ -3020,16 +4604,73 @@
           </w:tcPr>
           <w:p>
             <w:pPr>
-              <w:spacing w:after="0"/>
-            </w:pPr>
-            <w:r/>
-            <w:r>
-              <w:rPr>
-                <w:rFonts w:ascii="微软雅黑" w:hAnsi="微软雅黑" w:eastAsia="微软雅黑"/>
-                <w:b w:val="0"/>
-                <w:sz w:val="18"/>
-              </w:rPr>
-              <w:t>■自制</w:t>
+              <w:rPr>
+                <w:rFonts w:ascii="仿宋" w:eastAsia="仿宋" w:hAnsi="仿宋" w:hint="eastAsia"/>
+                <w:color w:val="000000" w:themeColor="text1"/>
+              </w:rPr>
+            </w:pPr>
+            <w:r>
+              <w:rPr>
+                <w:rFonts w:ascii="仿宋" w:eastAsia="仿宋" w:hAnsi="仿宋" w:hint="eastAsia"/>
+                <w:color w:val="000000" w:themeColor="text1"/>
+              </w:rPr>
+              <w:t>■自制  □未知版权</w:t>
+            </w:r>
+          </w:p>
+          <w:p>
+            <w:pPr>
+              <w:rPr>
+                <w:rFonts w:ascii="仿宋" w:eastAsia="仿宋" w:hAnsi="仿宋" w:hint="eastAsia"/>
+                <w:color w:val="000000" w:themeColor="text1"/>
+              </w:rPr>
+            </w:pPr>
+            <w:r>
+              <w:rPr>
+                <w:rFonts w:ascii="仿宋" w:eastAsia="仿宋" w:hAnsi="仿宋" w:hint="eastAsia"/>
+                <w:color w:val="000000" w:themeColor="text1"/>
+              </w:rPr>
+              <w:t>□开源  □获得授权</w:t>
+            </w:r>
+          </w:p>
+          <w:p>
+            <w:pPr>
+              <w:rPr>
+                <w:rFonts w:ascii="仿宋" w:eastAsia="仿宋" w:hAnsi="仿宋" w:hint="eastAsia"/>
+                <w:color w:val="000000" w:themeColor="text1"/>
+              </w:rPr>
+            </w:pPr>
+            <w:r>
+              <w:rPr>
+                <w:rFonts w:ascii="仿宋" w:eastAsia="仿宋" w:hAnsi="仿宋"/>
+                <w:color w:val="000000" w:themeColor="text1"/>
+                <w:u w:val="single"/>
+              </w:rPr>
+              <w:tab/>
+            </w:r>
+            <w:r>
+              <w:rPr>
+                <w:rFonts w:ascii="仿宋" w:eastAsia="仿宋" w:hAnsi="仿宋"/>
+                <w:color w:val="000000" w:themeColor="text1"/>
+                <w:u w:val="single"/>
+              </w:rPr>
+              <w:tab/>
+            </w:r>
+            <w:r>
+              <w:rPr>
+                <w:rFonts w:ascii="仿宋" w:eastAsia="仿宋" w:hAnsi="仿宋"/>
+                <w:color w:val="000000" w:themeColor="text1"/>
+                <w:u w:val="single"/>
+              </w:rPr>
+              <w:tab/>
+            </w:r>
+            <w:r>
+              <w:rPr>
+                <w:rFonts w:ascii="仿宋" w:eastAsia="仿宋" w:hAnsi="仿宋"/>
+                <w:color w:val="000000" w:themeColor="text1"/>
+                <w:u w:val="single"/>
+              </w:rPr>
+              <w:tab/>
+              <w:t xml:space="preserve">  </w:t>
             </w:r>
           </w:p>
         </w:tc>
@@ -3074,27 +4715,30 @@
           </w:tcPr>
           <w:p>
             <w:pPr>
-              <w:spacing w:after="0"/>
-            </w:pPr>
-            <w:r/>
-            <w:r>
-              <w:rPr>
-                <w:rFonts w:ascii="微软雅黑" w:hAnsi="微软雅黑" w:eastAsia="微软雅黑"/>
-                <w:b w:val="0"/>
-                <w:sz w:val="18"/>
+              <w:rPr>
+                <w:rFonts w:ascii="仿宋" w:eastAsia="仿宋" w:hAnsi="仿宋" w:hint="eastAsia"/>
+                <w:color w:val="000000" w:themeColor="text1"/>
+              </w:rPr>
+            </w:pPr>
+            <w:r>
+              <w:rPr>
+                <w:rFonts w:ascii="仿宋" w:eastAsia="仿宋" w:hAnsi="仿宋" w:hint="eastAsia"/>
+                <w:color w:val="000000" w:themeColor="text1"/>
               </w:rPr>
               <w:t>文件名：4 其他/提交说明与待替换信息</w:t>
             </w:r>
           </w:p>
           <w:p>
             <w:pPr>
-              <w:spacing w:after="0"/>
-            </w:pPr>
-            <w:r>
-              <w:rPr>
-                <w:rFonts w:ascii="微软雅黑" w:hAnsi="微软雅黑" w:eastAsia="微软雅黑"/>
-                <w:b w:val="0"/>
-                <w:sz w:val="18"/>
+              <w:rPr>
+                <w:rFonts w:ascii="仿宋" w:eastAsia="仿宋" w:hAnsi="仿宋" w:hint="eastAsia"/>
+                <w:color w:val="000000" w:themeColor="text1"/>
+              </w:rPr>
+            </w:pPr>
+            <w:r>
+              <w:rPr>
+                <w:rFonts w:ascii="仿宋" w:eastAsia="仿宋" w:hAnsi="仿宋" w:hint="eastAsia"/>
+                <w:color w:val="000000" w:themeColor="text1"/>
               </w:rPr>
               <w:t>描述：补充说明目录结构与当前保留的占位信息。</w:t>
             </w:r>
@@ -3111,16 +4755,73 @@
           </w:tcPr>
           <w:p>
             <w:pPr>
-              <w:spacing w:after="0"/>
-            </w:pPr>
-            <w:r/>
-            <w:r>
-              <w:rPr>
-                <w:rFonts w:ascii="微软雅黑" w:hAnsi="微软雅黑" w:eastAsia="微软雅黑"/>
-                <w:b w:val="0"/>
-                <w:sz w:val="18"/>
+              <w:rPr>
+                <w:rFonts w:ascii="仿宋" w:eastAsia="仿宋" w:hAnsi="仿宋" w:hint="eastAsia"/>
+                <w:color w:val="000000" w:themeColor="text1"/>
+              </w:rPr>
+            </w:pPr>
+            <w:r>
+              <w:rPr>
+                <w:rFonts w:ascii="仿宋" w:eastAsia="仿宋" w:hAnsi="仿宋" w:hint="eastAsia"/>
+                <w:color w:val="000000" w:themeColor="text1"/>
               </w:rPr>
               <w:t>■已上传到网盘</w:t>
+            </w:r>
+          </w:p>
+          <w:p>
+            <w:pPr>
+              <w:rPr>
+                <w:rFonts w:ascii="仿宋" w:eastAsia="仿宋" w:hAnsi="仿宋" w:hint="eastAsia"/>
+                <w:color w:val="000000" w:themeColor="text1"/>
+              </w:rPr>
+            </w:pPr>
+            <w:r>
+              <w:rPr>
+                <w:rFonts w:ascii="仿宋" w:eastAsia="仿宋" w:hAnsi="仿宋" w:hint="eastAsia"/>
+                <w:color w:val="000000" w:themeColor="text1"/>
+              </w:rPr>
+              <w:t>□未上传，下载地址：</w:t>
+            </w:r>
+          </w:p>
+          <w:p>
+            <w:pPr>
+              <w:rPr>
+                <w:rFonts w:ascii="仿宋" w:eastAsia="仿宋" w:hAnsi="仿宋" w:hint="eastAsia"/>
+                <w:color w:val="000000" w:themeColor="text1"/>
+              </w:rPr>
+            </w:pPr>
+            <w:r>
+              <w:rPr>
+                <w:rFonts w:ascii="仿宋" w:eastAsia="仿宋" w:hAnsi="仿宋"/>
+                <w:color w:val="000000" w:themeColor="text1"/>
+                <w:u w:val="single"/>
+              </w:rPr>
+              <w:tab/>
+            </w:r>
+            <w:r>
+              <w:rPr>
+                <w:rFonts w:ascii="仿宋" w:eastAsia="仿宋" w:hAnsi="仿宋"/>
+                <w:color w:val="000000" w:themeColor="text1"/>
+                <w:u w:val="single"/>
+              </w:rPr>
+              <w:tab/>
+            </w:r>
+            <w:r>
+              <w:rPr>
+                <w:rFonts w:ascii="仿宋" w:eastAsia="仿宋" w:hAnsi="仿宋"/>
+                <w:color w:val="000000" w:themeColor="text1"/>
+                <w:u w:val="single"/>
+              </w:rPr>
+              <w:tab/>
+            </w:r>
+            <w:r>
+              <w:rPr>
+                <w:rFonts w:ascii="仿宋" w:eastAsia="仿宋" w:hAnsi="仿宋"/>
+                <w:color w:val="000000" w:themeColor="text1"/>
+                <w:u w:val="single"/>
+              </w:rPr>
+              <w:tab/>
+              <w:t xml:space="preserve">     </w:t>
             </w:r>
           </w:p>
         </w:tc>
@@ -3132,16 +4833,73 @@
           </w:tcPr>
           <w:p>
             <w:pPr>
-              <w:spacing w:after="0"/>
-            </w:pPr>
-            <w:r/>
-            <w:r>
-              <w:rPr>
-                <w:rFonts w:ascii="微软雅黑" w:hAnsi="微软雅黑" w:eastAsia="微软雅黑"/>
-                <w:b w:val="0"/>
-                <w:sz w:val="18"/>
-              </w:rPr>
-              <w:t>■自制</w:t>
+              <w:rPr>
+                <w:rFonts w:ascii="仿宋" w:eastAsia="仿宋" w:hAnsi="仿宋" w:hint="eastAsia"/>
+                <w:color w:val="000000" w:themeColor="text1"/>
+              </w:rPr>
+            </w:pPr>
+            <w:r>
+              <w:rPr>
+                <w:rFonts w:ascii="仿宋" w:eastAsia="仿宋" w:hAnsi="仿宋" w:hint="eastAsia"/>
+                <w:color w:val="000000" w:themeColor="text1"/>
+              </w:rPr>
+              <w:t>■自制  □未知版权</w:t>
+            </w:r>
+          </w:p>
+          <w:p>
+            <w:pPr>
+              <w:rPr>
+                <w:rFonts w:ascii="仿宋" w:eastAsia="仿宋" w:hAnsi="仿宋" w:hint="eastAsia"/>
+                <w:color w:val="000000" w:themeColor="text1"/>
+              </w:rPr>
+            </w:pPr>
+            <w:r>
+              <w:rPr>
+                <w:rFonts w:ascii="仿宋" w:eastAsia="仿宋" w:hAnsi="仿宋" w:hint="eastAsia"/>
+                <w:color w:val="000000" w:themeColor="text1"/>
+              </w:rPr>
+              <w:t>□开源  □获得授权</w:t>
+            </w:r>
+          </w:p>
+          <w:p>
+            <w:pPr>
+              <w:rPr>
+                <w:rFonts w:ascii="仿宋" w:eastAsia="仿宋" w:hAnsi="仿宋" w:hint="eastAsia"/>
+                <w:color w:val="000000" w:themeColor="text1"/>
+              </w:rPr>
+            </w:pPr>
+            <w:r>
+              <w:rPr>
+                <w:rFonts w:ascii="仿宋" w:eastAsia="仿宋" w:hAnsi="仿宋"/>
+                <w:color w:val="000000" w:themeColor="text1"/>
+                <w:u w:val="single"/>
+              </w:rPr>
+              <w:tab/>
+            </w:r>
+            <w:r>
+              <w:rPr>
+                <w:rFonts w:ascii="仿宋" w:eastAsia="仿宋" w:hAnsi="仿宋"/>
+                <w:color w:val="000000" w:themeColor="text1"/>
+                <w:u w:val="single"/>
+              </w:rPr>
+              <w:tab/>
+            </w:r>
+            <w:r>
+              <w:rPr>
+                <w:rFonts w:ascii="仿宋" w:eastAsia="仿宋" w:hAnsi="仿宋"/>
+                <w:color w:val="000000" w:themeColor="text1"/>
+                <w:u w:val="single"/>
+              </w:rPr>
+              <w:tab/>
+            </w:r>
+            <w:r>
+              <w:rPr>
+                <w:rFonts w:ascii="仿宋" w:eastAsia="仿宋" w:hAnsi="仿宋"/>
+                <w:color w:val="000000" w:themeColor="text1"/>
+                <w:u w:val="single"/>
+              </w:rPr>
+              <w:tab/>
+              <w:t xml:space="preserve">  </w:t>
             </w:r>
           </w:p>
         </w:tc>
@@ -3161,67 +4919,153 @@
           </w:tcPr>
           <w:p>
             <w:pPr>
-              <w:spacing w:after="0"/>
-            </w:pPr>
-            <w:r/>
-            <w:r>
-              <w:rPr>
-                <w:rFonts w:ascii="微软雅黑" w:hAnsi="微软雅黑" w:eastAsia="微软雅黑"/>
-                <w:b w:val="0"/>
-                <w:sz w:val="20"/>
+              <w:rPr>
+                <w:rFonts w:ascii="仿宋" w:eastAsia="仿宋" w:hAnsi="仿宋" w:hint="eastAsia"/>
+                <w:b/>
+                <w:smallCaps/>
+                <w:sz w:val="28"/>
+                <w:szCs w:val="28"/>
+              </w:rPr>
+            </w:pPr>
+            <w:r>
+              <w:rPr>
+                <w:rFonts w:ascii="仿宋" w:eastAsia="仿宋" w:hAnsi="仿宋" w:hint="eastAsia"/>
+                <w:b/>
+                <w:smallCaps/>
+                <w:sz w:val="28"/>
+                <w:szCs w:val="28"/>
               </w:rPr>
               <w:t>本作品全体参赛队员郑重承诺：</w:t>
             </w:r>
           </w:p>
           <w:p>
             <w:pPr>
-              <w:spacing w:after="0"/>
-            </w:pPr>
-            <w:r>
-              <w:rPr>
-                <w:rFonts w:ascii="微软雅黑" w:hAnsi="微软雅黑" w:eastAsia="微软雅黑"/>
-                <w:b w:val="0"/>
-                <w:sz w:val="20"/>
+              <w:ind w:firstLineChars="200" w:firstLine="420"/>
+              <w:rPr>
+                <w:rFonts w:ascii="仿宋" w:eastAsia="仿宋" w:hAnsi="仿宋" w:hint="eastAsia"/>
+                <w:smallCaps/>
+                <w:szCs w:val="21"/>
+              </w:rPr>
+            </w:pPr>
+            <w:r>
+              <w:rPr>
+                <w:rFonts w:ascii="仿宋" w:eastAsia="仿宋" w:hAnsi="仿宋" w:hint="eastAsia"/>
+                <w:smallCaps/>
+                <w:szCs w:val="21"/>
               </w:rPr>
               <w:t>本作品全体参赛队员确认本表所列内容是正式参赛内容的重要组成部分，并严格按照本大类参赛作品类别提交要求提交了评审必需的文档、数据等参赛材料，本表内容按照要求如实填写。</w:t>
             </w:r>
           </w:p>
           <w:p>
             <w:pPr>
-              <w:spacing w:after="0"/>
-            </w:pPr>
-            <w:r>
-              <w:rPr>
-                <w:rFonts w:ascii="微软雅黑" w:hAnsi="微软雅黑" w:eastAsia="微软雅黑"/>
-                <w:b w:val="0"/>
-                <w:sz w:val="20"/>
-              </w:rPr>
-            </w:r>
-          </w:p>
-          <w:p>
-            <w:pPr>
-              <w:spacing w:after="0"/>
-            </w:pPr>
-            <w:r>
-              <w:rPr>
-                <w:rFonts w:ascii="微软雅黑" w:hAnsi="微软雅黑" w:eastAsia="微软雅黑"/>
-                <w:b w:val="0"/>
-                <w:sz w:val="20"/>
-              </w:rPr>
-              <w:t>全体参赛队员签名：____________________（可附电子签名）</w:t>
-            </w:r>
-          </w:p>
-          <w:p>
-            <w:pPr>
-              <w:spacing w:after="0"/>
-            </w:pPr>
-            <w:r>
-              <w:rPr>
-                <w:rFonts w:ascii="微软雅黑" w:hAnsi="微软雅黑" w:eastAsia="微软雅黑"/>
-                <w:b w:val="0"/>
-                <w:sz w:val="20"/>
-              </w:rPr>
-              <w:t>日期：______年______月______日</w:t>
+              <w:ind w:firstLineChars="200" w:firstLine="420"/>
+              <w:rPr>
+                <w:rFonts w:ascii="仿宋" w:eastAsia="仿宋" w:hAnsi="仿宋" w:hint="eastAsia"/>
+                <w:smallCaps/>
+                <w:szCs w:val="21"/>
+              </w:rPr>
+            </w:pPr>
+            <w:r>
+              <w:rPr>
+                <w:rFonts w:ascii="仿宋" w:eastAsia="仿宋" w:hAnsi="仿宋" w:hint="eastAsia"/>
+                <w:smallCaps/>
+                <w:szCs w:val="21"/>
+              </w:rPr>
+              <w:t>如因提交的参赛材料不符合要求，或本表填写内容不属实，将自愿承担因此导致奖项等级降低甚至终止本作品参加比赛的责任。</w:t>
+            </w:r>
+          </w:p>
+          <w:p>
+            <w:pPr>
+              <w:ind w:firstLineChars="200" w:firstLine="420"/>
+              <w:rPr>
+                <w:rFonts w:ascii="仿宋" w:eastAsia="仿宋" w:hAnsi="仿宋" w:hint="eastAsia"/>
+                <w:smallCaps/>
+                <w:szCs w:val="21"/>
+              </w:rPr>
+            </w:pPr>
+            <w:r>
+              <w:rPr>
+                <w:rFonts w:ascii="仿宋" w:eastAsia="仿宋" w:hAnsi="仿宋" w:hint="eastAsia"/>
+                <w:smallCaps/>
+                <w:szCs w:val="21"/>
+              </w:rPr>
+              <w:t>全体参赛队员签名：（可附授权使用的电子签名图片）</w:t>
+            </w:r>
+          </w:p>
+          <w:p>
+            <w:pPr>
+              <w:ind w:firstLineChars="200" w:firstLine="420"/>
+              <w:rPr>
+                <w:rFonts w:ascii="仿宋" w:eastAsia="仿宋" w:hAnsi="仿宋" w:hint="eastAsia"/>
+                <w:smallCaps/>
+                <w:szCs w:val="21"/>
+              </w:rPr>
+            </w:pPr>
+          </w:p>
+          <w:p>
+            <w:pPr>
+              <w:ind w:firstLineChars="2700" w:firstLine="5670"/>
+              <w:rPr>
+                <w:rFonts w:ascii="仿宋" w:eastAsia="仿宋" w:hAnsi="仿宋" w:hint="eastAsia"/>
+                <w:smallCaps/>
+                <w:color w:val="000000" w:themeColor="text1"/>
+              </w:rPr>
+            </w:pPr>
+            <w:r>
+              <w:rPr>
+                <w:rFonts w:ascii="仿宋" w:eastAsia="仿宋" w:hAnsi="仿宋" w:hint="eastAsia"/>
+                <w:smallCaps/>
+                <w:szCs w:val="21"/>
+              </w:rPr>
+              <w:t xml:space="preserve">日期： </w:t>
+            </w:r>
+            <w:r>
+              <w:rPr>
+                <w:rFonts w:ascii="仿宋" w:eastAsia="仿宋" w:hAnsi="仿宋"/>
+                <w:smallCaps/>
+                <w:szCs w:val="21"/>
+              </w:rPr>
+              <w:t xml:space="preserve">    </w:t>
+            </w:r>
+            <w:r>
+              <w:rPr>
+                <w:rFonts w:ascii="仿宋" w:eastAsia="仿宋" w:hAnsi="仿宋" w:hint="eastAsia"/>
+                <w:smallCaps/>
+                <w:szCs w:val="21"/>
+              </w:rPr>
+              <w:t xml:space="preserve">年 </w:t>
+            </w:r>
+            <w:r>
+              <w:rPr>
+                <w:rFonts w:ascii="仿宋" w:eastAsia="仿宋" w:hAnsi="仿宋"/>
+                <w:smallCaps/>
+                <w:szCs w:val="21"/>
+              </w:rPr>
+              <w:t xml:space="preserve">   </w:t>
+            </w:r>
+            <w:r>
+              <w:rPr>
+                <w:rFonts w:ascii="仿宋" w:eastAsia="仿宋" w:hAnsi="仿宋" w:hint="eastAsia"/>
+                <w:smallCaps/>
+                <w:szCs w:val="21"/>
+              </w:rPr>
+              <w:t xml:space="preserve">月 </w:t>
+            </w:r>
+            <w:r>
+              <w:rPr>
+                <w:rFonts w:ascii="仿宋" w:eastAsia="仿宋" w:hAnsi="仿宋"/>
+                <w:smallCaps/>
+                <w:szCs w:val="21"/>
+              </w:rPr>
+              <w:t xml:space="preserve">    </w:t>
+            </w:r>
+            <w:r>
+              <w:rPr>
+                <w:rFonts w:ascii="仿宋" w:eastAsia="仿宋" w:hAnsi="仿宋" w:hint="eastAsia"/>
+                <w:smallCaps/>
+                <w:szCs w:val="21"/>
+              </w:rPr>
+              <w:t>日</w:t>
             </w:r>
           </w:p>
         </w:tc>
@@ -3727,7 +5571,7 @@
     </w:p>
     <w:sectPr>
       <w:pgSz w:w="11906" w:h="16838"/>
-      <w:pgMar w:top="1247" w:right="1247" w:bottom="1134" w:left="1361" w:header="851" w:footer="992" w:gutter="0"/>
+      <w:pgMar w:top="1440" w:right="1800" w:bottom="1440" w:left="1800" w:header="851" w:footer="992" w:gutter="0"/>
       <w:cols w:space="425"/>
       <w:titlePg/>
       <w:docGrid w:type="lines" w:linePitch="312"/>
@@ -4382,9 +6226,8 @@
       <w:jc w:val="both"/>
     </w:pPr>
     <w:rPr>
-      <w:rFonts w:ascii="微软雅黑" w:hAnsi="微软雅黑" w:eastAsia="微软雅黑"/>
       <w:kern w:val="2"/>
-      <w:sz w:val="22"/>
+      <w:sz w:val="21"/>
       <w:szCs w:val="22"/>
     </w:rPr>
   </w:style>
@@ -4406,7 +6249,7 @@
       <w:outlineLvl w:val="0"/>
     </w:pPr>
     <w:rPr>
-      <w:rFonts w:eastAsia="微软雅黑" w:ascii="微软雅黑" w:hAnsi="微软雅黑"/>
+      <w:rFonts w:eastAsia="黑体"/>
       <w:bCs/>
       <w:kern w:val="44"/>
       <w:sz w:val="44"/>

</xml_diff>